<commit_message>
Worked on filling 'PCTRptFileOfApp' and 'PCTCommRe' with UI and database information.
</commit_message>
<xml_diff>
--- a/project/documents/merged/Document.docx
+++ b/project/documents/merged/Document.docx
@@ -291,21 +291,18 @@
           <w:noProof/>
           <w:u w:val="single"/>
         </w:rPr>
-        <w:t>&lt;&lt;lp</w:t>
-      </w:r>
-      <w:r>
-        <w:rPr>
-          <w:noProof/>
-          <w:u w:val="single"/>
-        </w:rPr>
-        <w:t>X</w:t>
-      </w:r>
-      <w:r>
-        <w:rPr>
-          <w:noProof/>
-          <w:u w:val="single"/>
-        </w:rPr>
-        <w:t>&gt;&gt;</w:t>
+      </w:r>
+      <w:r>
+        <w:rPr>
+          <w:noProof/>
+          <w:u w:val="single"/>
+        </w:rPr>
+      </w:r>
+      <w:r>
+        <w:rPr>
+          <w:noProof/>
+          <w:u w:val="single"/>
+        </w:rPr>
       </w:r>
       <w:r>
         <w:rPr>
@@ -317,17 +314,10 @@
         <w:rPr>
           <w:noProof/>
         </w:rPr>
-        <w:t>&lt;&lt;</w:t>
-      </w:r>
-      <w:r>
-        <w:t>seqList</w:t>
-      </w:r>
-      <w:r>
-        <w:t>ingLine</w:t>
-      </w:r>
-      <w:r>
-        <w:t>&gt;&gt;</w:t>
-      </w:r>
+      </w:r>
+      <w:r/>
+      <w:r/>
+      <w:r/>
     </w:p>
     <w:p>
       <w:pPr>
@@ -345,21 +335,18 @@
           <w:noProof/>
           <w:u w:val="single"/>
         </w:rPr>
-        <w:t>&lt;&lt;rf</w:t>
-      </w:r>
-      <w:r>
-        <w:rPr>
-          <w:noProof/>
-          <w:u w:val="single"/>
-        </w:rPr>
-        <w:t>X</w:t>
-      </w:r>
-      <w:r>
-        <w:rPr>
-          <w:noProof/>
-          <w:u w:val="single"/>
-        </w:rPr>
-        <w:t>&gt;&gt;</w:t>
+      </w:r>
+      <w:r>
+        <w:rPr>
+          <w:noProof/>
+          <w:u w:val="single"/>
+        </w:rPr>
+      </w:r>
+      <w:r>
+        <w:rPr>
+          <w:noProof/>
+          <w:u w:val="single"/>
+        </w:rPr>
       </w:r>
       <w:r>
         <w:rPr>
@@ -386,21 +373,18 @@
           <w:noProof/>
           <w:u w:val="single"/>
         </w:rPr>
-        <w:t>&lt;&lt;cd</w:t>
-      </w:r>
-      <w:r>
-        <w:rPr>
-          <w:noProof/>
-          <w:u w:val="single"/>
-        </w:rPr>
-        <w:t>X</w:t>
-      </w:r>
-      <w:r>
-        <w:rPr>
-          <w:noProof/>
-          <w:u w:val="single"/>
-        </w:rPr>
-        <w:t>&gt;&gt;</w:t>
+      </w:r>
+      <w:r>
+        <w:rPr>
+          <w:noProof/>
+          <w:u w:val="single"/>
+        </w:rPr>
+      </w:r>
+      <w:r>
+        <w:rPr>
+          <w:noProof/>
+          <w:u w:val="single"/>
+        </w:rPr>
       </w:r>
       <w:r>
         <w:rPr>
@@ -412,11 +396,8 @@
         <w:rPr>
           <w:noProof/>
         </w:rPr>
-        <w:t>&lt;&lt;chgD</w:t>
-      </w:r>
-      <w:r>
-        <w:t>epAcct&gt;&gt;</w:t>
-      </w:r>
+      </w:r>
+      <w:r/>
       <w:r>
         <w:rPr>
           <w:noProof/>
@@ -457,7 +438,7 @@
           <w:bCs/>
           <w:noProof/>
         </w:rPr>
-        <w:t>&lt;&lt;depAccount</w:t>
+        <w:t>Please charge any additional required fees or credit overpayment to Deposit Account 19-0743.</w:t>
       </w:r>
       <w:r>
         <w:rPr>
@@ -465,7 +446,6 @@
           <w:bCs/>
           <w:noProof/>
         </w:rPr>
-        <w:t>Line</w:t>
       </w:r>
       <w:r>
         <w:rPr>
@@ -473,7 +453,6 @@
           <w:bCs/>
           <w:noProof/>
         </w:rPr>
-        <w:t>&gt;&gt;</w:t>
       </w:r>
     </w:p>
     <w:p>
@@ -548,7 +527,7 @@
           <w:sz w:val="22"/>
           <w:szCs w:val="22"/>
         </w:rPr>
-        <w:t xml:space="preserve">      &lt;&lt;echoSignature&gt;&gt;</w:t>
+        <w:t xml:space="preserve">      </w:t>
       </w:r>
     </w:p>
     <w:p>
@@ -651,14 +630,10 @@
         <w:t xml:space="preserve">     </w:t>
       </w:r>
       <w:r>
-        <w:t>&lt;&lt;</w:t>
-      </w:r>
-      <w:r>
-        <w:t>sel</w:t>
-      </w:r>
-      <w:r>
-        <w:t>SAName&gt;&gt;</w:t>
-      </w:r>
+        <w:t>Bradley Scheer</w:t>
+      </w:r>
+      <w:r/>
+      <w:r/>
     </w:p>
     <w:p>
       <w:pPr>
@@ -995,21 +970,18 @@
           <w:noProof/>
           <w:color w:val="000000"/>
         </w:rPr>
-        <w:t>&lt;&lt;</w:t>
       </w:r>
       <w:r>
         <w:rPr>
           <w:noProof/>
           <w:color w:val="000000"/>
         </w:rPr>
-        <w:t>mail</w:t>
       </w:r>
       <w:r>
         <w:rPr>
           <w:noProof/>
           <w:color w:val="000000"/>
         </w:rPr>
-        <w:t>Date&gt;&gt;</w:t>
       </w:r>
       <w:r>
         <w:rPr>
@@ -1173,9 +1145,7 @@
         </w:rPr>
         <w:t xml:space="preserve"> </w:t>
       </w:r>
-      <w:r>
-        <w:t>&lt;&lt;signatureDate&gt;&gt;</w:t>
-      </w:r>
+      <w:r/>
       <w:r>
         <w:tab/>
         <w:t xml:space="preserve">      </w:t>
@@ -1184,9 +1154,7 @@
         <w:tab/>
         <w:t xml:space="preserve">       </w:t>
       </w:r>
-      <w:r>
-        <w:t>&lt;&lt;echoSignature&gt;&gt;</w:t>
-      </w:r>
+      <w:r/>
     </w:p>
     <w:p>
       <w:pPr>
@@ -1273,14 +1241,10 @@
         </w:rPr>
       </w:pPr>
       <w:r>
-        <w:t>&lt;&lt;</w:t>
-      </w:r>
-      <w:r>
-        <w:t>sel</w:t>
-      </w:r>
-      <w:r>
-        <w:t>SAName&gt;&gt;</w:t>
-      </w:r>
+        <w:t>Bradley Scheer</w:t>
+      </w:r>
+      <w:r/>
+      <w:r/>
     </w:p>
     <w:p>
       <w:pPr>

</xml_diff>

<commit_message>
Worked on 'RptInvtPayFees' and 'PctCommRe' merges.
</commit_message>
<xml_diff>
--- a/project/documents/merged/Document.docx
+++ b/project/documents/merged/Document.docx
@@ -230,7 +230,7 @@
         <w:rPr>
           <w:sz w:val="24"/>
         </w:rPr>
-        <w:t>$Burns$ Industries - Springfield</w:t>
+        <w:t>&lt;&lt;orgName&gt;&gt;</w:t>
       </w:r>
     </w:p>
     <w:p>
@@ -301,7 +301,7 @@
         <w:rPr>
           <w:sz w:val="24"/>
         </w:rPr>
-        <w:t xml:space="preserve">$Burns$ Industries - Springfield </w:t>
+        <w:t xml:space="preserve">&lt;&lt;orgName&gt;&gt; </w:t>
       </w:r>
       <w:r>
         <w:rPr>
@@ -325,7 +325,7 @@
           <w:noProof/>
           <w:sz w:val="24"/>
         </w:rPr>
-        <w:t xml:space="preserve"> SLW Ref. No. 1.003US1</w:t>
+        <w:t xml:space="preserve"> SLW Ref. No. &lt;&lt;matterNo&gt;&gt;</w:t>
       </w:r>
     </w:p>
     <w:p>
@@ -347,7 +347,7 @@
           <w:noProof/>
           <w:sz w:val="24"/>
         </w:rPr>
-        <w:t>12/356,986</w:t>
+        <w:t>&lt;&lt;serialNo&gt;&gt;</w:t>
       </w:r>
     </w:p>
     <w:p>
@@ -377,7 +377,7 @@
           <w:noProof/>
           <w:sz w:val="24"/>
         </w:rPr>
-        <w:t>Method and apparatus for making a title for a matter 1000</w:t>
+        <w:t>&lt;&lt;title&gt;&gt;</w:t>
       </w:r>
     </w:p>
     <w:p>
@@ -547,7 +547,6 @@
         <w:rPr>
           <w:sz w:val="24"/>
         </w:rPr>
-        <w:t>and a Communication Regarding the Results of the Partial International Search</w:t>
       </w:r>
       <w:r>
         <w:rPr>
@@ -666,9 +665,9 @@
         <w:rPr>
           <w:sz w:val="24"/>
         </w:rPr>
-        <w:t xml:space="preserve">  545454</w:t>
+        <w:t xml:space="preserve">  123</w:t>
         <w:br/>
-        <w:t xml:space="preserve">  12221      </w:t>
+        <w:t xml:space="preserve"> 789      </w:t>
       </w:r>
       <w:r>
         <w:rPr>
@@ -686,9 +685,9 @@
         <w:rPr>
           <w:sz w:val="24"/>
         </w:rPr>
-        <w:t>899898</w:t>
+        <w:t>456</w:t>
         <w:br/>
-        <w:t>12212</w:t>
+        <w:t xml:space="preserve">                101</w:t>
       </w:r>
     </w:p>
     <w:p>
@@ -752,7 +751,7 @@
         <w:rPr>
           <w:sz w:val="24"/>
         </w:rPr>
-        <w:t>54</w:t>
+        <w:t>wer</w:t>
       </w:r>
       <w:r>
         <w:rPr>

</xml_diff>

<commit_message>
Fixed merges not working without reloading page.
</commit_message>
<xml_diff>
--- a/project/documents/merged/Document.docx
+++ b/project/documents/merged/Document.docx
@@ -126,7 +126,7 @@
       <w:r>
         <w:t>The International Bureau of WIPO</w:t>
         <w:br/>
-        <w:t>34, chemin des Colombettes</w:t>
+        <w:t>34, Chemin Des Colombettes</w:t>
         <w:br/>
         <w:t>1211 Geneva 20</w:t>
         <w:br/>
@@ -195,21 +195,19 @@
           <w:b/>
           <w:u w:val="single"/>
         </w:rPr>
-        <w:t>via &lt;&lt;</w:t>
+        <w:t xml:space="preserve">via </w:t>
       </w:r>
       <w:r>
         <w:rPr>
           <w:b/>
           <w:u w:val="single"/>
         </w:rPr>
-        <w:t>tv</w:t>
       </w:r>
       <w:r>
         <w:rPr>
           <w:b/>
           <w:u w:val="single"/>
         </w:rPr>
-        <w:t>USPSDHL&gt;&gt;</w:t>
       </w:r>
       <w:r>
         <w:rPr>
@@ -297,7 +295,6 @@
           <w:noProof/>
           <w:u w:val="single"/>
         </w:rPr>
-        <w:t>X</w:t>
       </w:r>
       <w:r>
         <w:rPr>
@@ -321,7 +318,6 @@
         <w:rPr>
           <w:noProof/>
         </w:rPr>
-        <w:t>Sequence Listing on Paper (034 pgs).</w:t>
       </w:r>
       <w:r/>
       <w:r/>
@@ -381,7 +377,6 @@
           <w:noProof/>
           <w:u w:val="single"/>
         </w:rPr>
-        <w:t>X</w:t>
       </w:r>
       <w:r>
         <w:rPr>
@@ -405,7 +400,6 @@
         <w:rPr>
           <w:noProof/>
         </w:rPr>
-        <w:t>Please charge Deposit Account 19-0743 in the amount of $0.0034</w:t>
       </w:r>
       <w:r/>
       <w:r>
@@ -537,7 +531,7 @@
           <w:sz w:val="22"/>
           <w:szCs w:val="22"/>
         </w:rPr>
-        <w:t xml:space="preserve">      / {{Sig_es_:signer1:signature}} /</w:t>
+        <w:t xml:space="preserve">      </w:t>
       </w:r>
     </w:p>
     <w:p>
@@ -941,7 +935,7 @@
       <w:r>
         <w:t>The International Bureau of WIPO</w:t>
         <w:br/>
-        <w:t>34, chemin des Colombettes</w:t>
+        <w:t>34, Chemin Des Colombettes</w:t>
         <w:br/>
         <w:t>1211 Geneva 20</w:t>
         <w:br/>
@@ -984,7 +978,6 @@
           <w:noProof/>
           <w:color w:val="000000"/>
         </w:rPr>
-        <w:t>34</w:t>
       </w:r>
       <w:r>
         <w:rPr>
@@ -1160,9 +1153,7 @@
         </w:rPr>
         <w:t xml:space="preserve"> </w:t>
       </w:r>
-      <w:r>
-        <w:t>{{Dte_es_:signer1:date}}</w:t>
-      </w:r>
+      <w:r/>
       <w:r>
         <w:tab/>
         <w:t xml:space="preserve">      </w:t>
@@ -1171,9 +1162,7 @@
         <w:tab/>
         <w:t xml:space="preserve">       </w:t>
       </w:r>
-      <w:r>
-        <w:t>/ {{Sig_es_:signer1:signature}} /</w:t>
-      </w:r>
+      <w:r/>
     </w:p>
     <w:p>
       <w:pPr>

</xml_diff>

<commit_message>
Created function to fill applicant information
</commit_message>
<xml_diff>
--- a/project/documents/merged/Document.docx
+++ b/project/documents/merged/Document.docx
@@ -361,6 +361,7 @@
                 <w:rFonts w:cstheme="minorHAnsi"/>
                 <w:bCs/>
               </w:rPr>
+              <w:t>Wiley E. Coyote</w:t>
             </w:r>
           </w:p>
         </w:tc>
@@ -12669,7 +12670,7 @@
               <w:rPr>
                 <w:rFonts w:cstheme="minorHAnsi"/>
               </w:rPr>
-              <w:t xml:space="preserve"> &lt;&lt;assigneeCity&gt;&gt;</w:t>
+              <w:t xml:space="preserve"> Dry Gulch</w:t>
             </w:r>
           </w:p>
         </w:tc>
@@ -12746,7 +12747,7 @@
               <w:rPr>
                 <w:rFonts w:cstheme="minorHAnsi"/>
               </w:rPr>
-              <w:t xml:space="preserve"> &lt;&lt;assigneeState&gt;&gt;</w:t>
+              <w:t xml:space="preserve"> NE</w:t>
             </w:r>
           </w:p>
         </w:tc>
@@ -12817,7 +12818,7 @@
               <w:rPr>
                 <w:rFonts w:eastAsia="Arial" w:cstheme="minorHAnsi"/>
               </w:rPr>
-              <w:t xml:space="preserve"> &lt;&lt;assigneeCountry&gt;&gt;</w:t>
+              <w:t xml:space="preserve"> US  </w:t>
             </w:r>
           </w:p>
         </w:tc>
@@ -12890,7 +12891,7 @@
               <w:rPr>
                 <w:rFonts w:cstheme="minorHAnsi"/>
               </w:rPr>
-              <w:t xml:space="preserve"> &lt;&lt;assigneeZip&gt;&gt;</w:t>
+              <w:t xml:space="preserve"> 88888</w:t>
             </w:r>
           </w:p>
         </w:tc>

</xml_diff>

<commit_message>
Transfered UI data for 'PCTRptFileOfApp' merge.
</commit_message>
<xml_diff>
--- a/project/documents/merged/Document.docx
+++ b/project/documents/merged/Document.docx
@@ -55,7 +55,7 @@
           <w:bCs/>
           <w:szCs w:val="20"/>
         </w:rPr>
-        <w:t>&lt;&lt;WAName&gt;&gt; &lt;&lt;WAPhone&gt;&gt;</w:t>
+        <w:t>Attorney Test 612-373-6900</w:t>
       </w:r>
     </w:p>
     <w:p>
@@ -75,7 +75,7 @@
           <w:bCs/>
           <w:szCs w:val="20"/>
         </w:rPr>
-        <w:t>&lt;&lt;WAEmail&gt;&gt;</w:t>
+        <w:t>mmartin@slwip.com</w:t>
       </w:r>
       <w:r>
         <w:rPr>
@@ -115,7 +115,7 @@
           <w:bCs/>
           <w:szCs w:val="20"/>
         </w:rPr>
-        <w:t>&lt;&lt;paraName&gt;&gt; &lt;&lt;paraPhone&gt;&gt;</w:t>
+        <w:t>Emily Bates 612-371-2163</w:t>
       </w:r>
       <w:r>
         <w:rPr>
@@ -141,7 +141,7 @@
           <w:bCs/>
           <w:szCs w:val="20"/>
         </w:rPr>
-        <w:t>&lt;&lt;paraEmail&gt;&gt;</w:t>
+        <w:t>ebates@slwip.com</w:t>
       </w:r>
     </w:p>
     <w:p>
@@ -871,7 +871,7 @@
         <w:rPr>
           <w:sz w:val="24"/>
         </w:rPr>
-        <w:t>&lt;&lt;WAName&gt;&gt;</w:t>
+        <w:t>Attorney Test</w:t>
       </w:r>
       <w:r>
         <w:rPr>
@@ -883,7 +883,7 @@
         <w:rPr>
           <w:sz w:val="24"/>
         </w:rPr>
-        <w:t>&lt;&lt;WAPhone&gt;&gt;</w:t>
+        <w:t>612-373-6900</w:t>
       </w:r>
       <w:r>
         <w:rPr>
@@ -895,7 +895,7 @@
         <w:rPr>
           <w:sz w:val="24"/>
         </w:rPr>
-        <w:t>&lt;&lt;paraName&gt;&gt;</w:t>
+        <w:t>Emily Bates</w:t>
       </w:r>
       <w:r>
         <w:rPr>
@@ -907,7 +907,7 @@
         <w:rPr>
           <w:sz w:val="24"/>
         </w:rPr>
-        <w:t>&lt;&lt;paraPhone&gt;&gt;</w:t>
+        <w:t>612-371-2163</w:t>
       </w:r>
       <w:r>
         <w:rPr>

</xml_diff>

<commit_message>
Updated 'PCTRptFileOfApp' UI. Added tags to merge function.
</commit_message>
<xml_diff>
--- a/project/documents/merged/Document.docx
+++ b/project/documents/merged/Document.docx
@@ -55,7 +55,7 @@
           <w:bCs/>
           <w:szCs w:val="20"/>
         </w:rPr>
-        <w:t>&lt;&lt;WAName&gt;&gt; &lt;&lt;WAPhone&gt;&gt;</w:t>
+        <w:t>Attorney Test 612-373-6900</w:t>
       </w:r>
     </w:p>
     <w:p>
@@ -75,7 +75,7 @@
           <w:bCs/>
           <w:szCs w:val="20"/>
         </w:rPr>
-        <w:t>&lt;&lt;WAEmail&gt;&gt;</w:t>
+        <w:t>mmartin@slwip.com</w:t>
       </w:r>
       <w:r>
         <w:rPr>
@@ -115,7 +115,7 @@
           <w:bCs/>
           <w:szCs w:val="20"/>
         </w:rPr>
-        <w:t>&lt;&lt;paraName&gt;&gt; &lt;&lt;paraPhone&gt;&gt;</w:t>
+        <w:t>Emily Bates 612-371-2163</w:t>
       </w:r>
       <w:r>
         <w:rPr>
@@ -141,7 +141,7 @@
           <w:bCs/>
           <w:szCs w:val="20"/>
         </w:rPr>
-        <w:t>&lt;&lt;paraEmail&gt;&gt;</w:t>
+        <w:t>ebates@slwip.com</w:t>
       </w:r>
     </w:p>
     <w:p>
@@ -471,7 +471,7 @@
         <w:rPr>
           <w:sz w:val="24"/>
         </w:rPr>
-        <w:t xml:space="preserve"> &lt;&lt;crcvOffice&gt;&gt; </w:t>
+        <w:t xml:space="preserve"> test2 </w:t>
       </w:r>
       <w:r>
         <w:rPr>
@@ -496,19 +496,17 @@
         <w:rPr>
           <w:sz w:val="24"/>
         </w:rPr>
-        <w:t>&lt;&lt;cp</w:t>
-      </w:r>
-      <w:r>
-        <w:rPr>
-          <w:sz w:val="24"/>
-        </w:rPr>
-        <w:t>atentOffice</w:t>
-      </w:r>
-      <w:r>
-        <w:rPr>
-          <w:sz w:val="24"/>
-        </w:rPr>
-        <w:t>&gt;&gt;</w:t>
+        <w:t>Test1</w:t>
+      </w:r>
+      <w:r>
+        <w:rPr>
+          <w:sz w:val="24"/>
+        </w:rPr>
+      </w:r>
+      <w:r>
+        <w:rPr>
+          <w:sz w:val="24"/>
+        </w:rPr>
       </w:r>
       <w:r>
         <w:rPr>
@@ -535,237 +533,137 @@
         <w:rPr>
           <w:sz w:val="24"/>
         </w:rPr>
-        <w:t>&lt;&lt;cpriorApps&gt;&gt;</w:t>
-      </w:r>
-    </w:p>
-    <w:p>
-      <w:pPr>
-        <w:rPr>
-          <w:noProof/>
-          <w:sz w:val="24"/>
-        </w:rPr>
-      </w:pPr>
-    </w:p>
-    <w:tbl>
-      <w:tblPr>
-        <w:tblW w:w="9115" w:type="dxa"/>
-        <w:tblLayout w:type="fixed"/>
-        <w:tblCellMar>
-          <w:left w:w="115" w:type="dxa"/>
-          <w:right w:w="115" w:type="dxa"/>
-        </w:tblCellMar>
-        <w:tblLook w:val="0000" w:firstRow="0" w:lastRow="0" w:firstColumn="0" w:lastColumn="0" w:noHBand="0" w:noVBand="0"/>
-      </w:tblPr>
-      <w:tblGrid>
-        <w:gridCol w:w="3175"/>
-        <w:gridCol w:w="2700"/>
-        <w:gridCol w:w="3240"/>
-      </w:tblGrid>
-      <w:tr>
-        <w:tblPrEx>
-          <w:tblCellMar>
-            <w:top w:w="0" w:type="dxa"/>
-            <w:bottom w:w="0" w:type="dxa"/>
-          </w:tblCellMar>
-        </w:tblPrEx>
-        <w:trPr>
-          <w:trHeight w:hRule="exact" w:val="288"/>
-        </w:trPr>
-        <w:tc>
-          <w:tcPr>
-            <w:tcW w:w="3175" w:type="dxa"/>
-          </w:tcPr>
-          <w:p>
-            <w:pPr>
-              <w:rPr>
-                <w:b/>
-                <w:noProof/>
-                <w:sz w:val="24"/>
-                <w:u w:val="single"/>
-              </w:rPr>
-            </w:pPr>
-            <w:r>
-              <w:rPr>
-                <w:b/>
-                <w:noProof/>
-                <w:sz w:val="24"/>
-                <w:u w:val="single"/>
-              </w:rPr>
-              <w:t>Serial Number</w:t>
-            </w:r>
-          </w:p>
-        </w:tc>
-        <w:tc>
-          <w:tcPr>
-            <w:tcW w:w="2700" w:type="dxa"/>
-          </w:tcPr>
-          <w:p>
-            <w:pPr>
-              <w:rPr>
-                <w:b/>
-                <w:noProof/>
-                <w:sz w:val="24"/>
-                <w:u w:val="single"/>
-              </w:rPr>
-            </w:pPr>
-            <w:r>
-              <w:rPr>
-                <w:b/>
-                <w:noProof/>
-                <w:sz w:val="24"/>
-                <w:u w:val="single"/>
-              </w:rPr>
-              <w:t>Date</w:t>
-            </w:r>
-          </w:p>
-        </w:tc>
-        <w:tc>
-          <w:tcPr>
-            <w:tcW w:w="3240" w:type="dxa"/>
-          </w:tcPr>
-          <w:p>
-            <w:pPr>
-              <w:rPr>
-                <w:b/>
-                <w:noProof/>
-                <w:sz w:val="24"/>
-                <w:u w:val="single"/>
-              </w:rPr>
-            </w:pPr>
-            <w:r>
-              <w:rPr>
-                <w:b/>
-                <w:noProof/>
-                <w:sz w:val="24"/>
-                <w:u w:val="single"/>
-              </w:rPr>
-              <w:t>Country</w:t>
-            </w:r>
-          </w:p>
-        </w:tc>
-      </w:tr>
-      <w:tr>
-        <w:tblPrEx>
-          <w:tblCellMar>
-            <w:top w:w="0" w:type="dxa"/>
-            <w:bottom w:w="0" w:type="dxa"/>
-          </w:tblCellMar>
-        </w:tblPrEx>
-        <w:trPr>
-          <w:trHeight w:hRule="exact" w:val="288"/>
-        </w:trPr>
-        <w:tc>
-          <w:tcPr>
-            <w:tcW w:w="3175" w:type="dxa"/>
-          </w:tcPr>
-          <w:p>
-            <w:pPr>
-              <w:rPr>
-                <w:noProof/>
-                <w:sz w:val="24"/>
-              </w:rPr>
-            </w:pPr>
-            <w:r>
-              <w:rPr>
-                <w:noProof/>
-                <w:sz w:val="24"/>
-              </w:rPr>
-              <w:t>&lt;&lt;prior</w:t>
-            </w:r>
-            <w:r>
-              <w:rPr>
-                <w:noProof/>
-                <w:sz w:val="24"/>
-              </w:rPr>
-              <w:t>App</w:t>
-            </w:r>
-            <w:r>
-              <w:rPr>
-                <w:noProof/>
-                <w:sz w:val="24"/>
-              </w:rPr>
-              <w:t>No&gt;&gt;</w:t>
-            </w:r>
-          </w:p>
-        </w:tc>
-        <w:tc>
-          <w:tcPr>
-            <w:tcW w:w="2700" w:type="dxa"/>
-          </w:tcPr>
-          <w:p>
-            <w:pPr>
-              <w:rPr>
-                <w:noProof/>
-                <w:sz w:val="24"/>
-              </w:rPr>
-            </w:pPr>
-            <w:r>
-              <w:rPr>
-                <w:noProof/>
-                <w:sz w:val="24"/>
-              </w:rPr>
-              <w:t>&lt;&lt;prior</w:t>
-            </w:r>
-            <w:r>
-              <w:rPr>
-                <w:noProof/>
-                <w:sz w:val="24"/>
-              </w:rPr>
-              <w:t>App</w:t>
-            </w:r>
-            <w:r>
-              <w:rPr>
-                <w:noProof/>
-                <w:sz w:val="24"/>
-              </w:rPr>
-              <w:t>Date&gt;&gt;</w:t>
-            </w:r>
-          </w:p>
-        </w:tc>
-        <w:tc>
-          <w:tcPr>
-            <w:tcW w:w="3240" w:type="dxa"/>
-          </w:tcPr>
-          <w:p>
-            <w:pPr>
-              <w:rPr>
-                <w:noProof/>
-                <w:sz w:val="24"/>
-              </w:rPr>
-            </w:pPr>
-            <w:r>
-              <w:rPr>
-                <w:noProof/>
-                <w:sz w:val="24"/>
-              </w:rPr>
-              <w:t>&lt;&lt;prior</w:t>
-            </w:r>
-            <w:r>
-              <w:rPr>
-                <w:noProof/>
-                <w:sz w:val="24"/>
-              </w:rPr>
-              <w:t>App</w:t>
-            </w:r>
-            <w:r>
-              <w:rPr>
-                <w:noProof/>
-                <w:sz w:val="24"/>
-              </w:rPr>
-              <w:t>Cntry&gt;&gt;</w:t>
-            </w:r>
-          </w:p>
-          <w:p>
-            <w:pPr>
-              <w:rPr>
-                <w:noProof/>
-                <w:sz w:val="24"/>
-              </w:rPr>
-            </w:pPr>
-          </w:p>
-        </w:tc>
-      </w:tr>
-    </w:tbl>
+        <w:t>The PCT application claims priority to the following earlier-filed application(s):</w:t>
+      </w:r>
+    </w:p>
+    <w:p>
+      <w:pPr>
+        <w:rPr>
+          <w:sz w:val="24"/>
+        </w:rPr>
+      </w:pPr>
+    </w:p>
+    <w:p>
+      <w:pPr>
+        <w:rPr>
+          <w:b/>
+          <w:noProof/>
+          <w:sz w:val="24"/>
+          <w:u w:val="single"/>
+        </w:rPr>
+      </w:pPr>
+      <w:r>
+        <w:rPr>
+          <w:b/>
+          <w:noProof/>
+          <w:sz w:val="24"/>
+          <w:u w:val="single"/>
+        </w:rPr>
+        <w:t>Serial Number</w:t>
+      </w:r>
+      <w:r>
+        <w:rPr>
+          <w:b/>
+          <w:noProof/>
+          <w:sz w:val="24"/>
+        </w:rPr>
+        <w:t xml:space="preserve">                            </w:t>
+      </w:r>
+      <w:r>
+        <w:rPr>
+          <w:b/>
+          <w:noProof/>
+          <w:sz w:val="24"/>
+          <w:u w:val="single"/>
+        </w:rPr>
+        <w:t>Date</w:t>
+      </w:r>
+      <w:r>
+        <w:rPr>
+          <w:b/>
+          <w:noProof/>
+          <w:sz w:val="24"/>
+        </w:rPr>
+        <w:tab/>
+      </w:r>
+      <w:r>
+        <w:rPr>
+          <w:b/>
+          <w:noProof/>
+          <w:sz w:val="24"/>
+        </w:rPr>
+        <w:tab/>
+      </w:r>
+      <w:r>
+        <w:rPr>
+          <w:b/>
+          <w:noProof/>
+          <w:sz w:val="24"/>
+        </w:rPr>
+        <w:tab/>
+        <w:t xml:space="preserve">  </w:t>
+      </w:r>
+      <w:r>
+        <w:rPr>
+          <w:b/>
+          <w:noProof/>
+          <w:sz w:val="24"/>
+          <w:u w:val="single"/>
+        </w:rPr>
+        <w:t>Country</w:t>
+      </w:r>
+    </w:p>
+    <w:p>
+      <w:pPr>
+        <w:rPr>
+          <w:noProof/>
+          <w:sz w:val="24"/>
+        </w:rPr>
+      </w:pPr>
+      <w:r>
+        <w:rPr>
+          <w:noProof/>
+          <w:sz w:val="24"/>
+        </w:rPr>
+        <w:t>12/356,986</w:t>
+      </w:r>
+      <w:r>
+        <w:rPr>
+          <w:noProof/>
+          <w:sz w:val="24"/>
+        </w:rPr>
+        <w:tab/>
+      </w:r>
+      <w:r>
+        <w:rPr>
+          <w:noProof/>
+          <w:sz w:val="24"/>
+        </w:rPr>
+        <w:tab/>
+        <w:t xml:space="preserve">     </w:t>
+      </w:r>
+      <w:r>
+        <w:rPr>
+          <w:noProof/>
+          <w:sz w:val="24"/>
+        </w:rPr>
+        <w:t>August 21,  2023</w:t>
+      </w:r>
+      <w:r>
+        <w:rPr>
+          <w:noProof/>
+          <w:sz w:val="24"/>
+        </w:rPr>
+        <w:t xml:space="preserve">              </w:t>
+      </w:r>
+      <w:r>
+        <w:rPr>
+          <w:noProof/>
+          <w:sz w:val="24"/>
+        </w:rPr>
+        <w:t xml:space="preserve">US  </w:t>
+      </w:r>
+    </w:p>
     <w:p>
       <w:pPr>
         <w:rPr>
@@ -787,7 +685,7 @@
           <w:color w:val="000000"/>
           <w:sz w:val="24"/>
         </w:rPr>
-        <w:t>&lt;&lt;excluDesigPhs&gt;&gt;</w:t>
+        <w:t>The application designated all PCT contracting states except JP. The exclusion of this designation prevents the priority application from becoming abandoned, in accordance with country law.&lt;br&gt;</w:t>
       </w:r>
     </w:p>
     <w:p>
@@ -838,7 +736,7 @@
           <w:noProof/>
           <w:sz w:val="24"/>
         </w:rPr>
-        <w:t>&lt;&lt;actionText&gt;&gt;</w:t>
+        <w:t>ACTION REQUIRED: None at this time.</w:t>
       </w:r>
     </w:p>
     <w:p>
@@ -871,7 +769,7 @@
         <w:rPr>
           <w:sz w:val="24"/>
         </w:rPr>
-        <w:t>&lt;&lt;WAName&gt;&gt;</w:t>
+        <w:t>Attorney Test</w:t>
       </w:r>
       <w:r>
         <w:rPr>
@@ -883,7 +781,7 @@
         <w:rPr>
           <w:sz w:val="24"/>
         </w:rPr>
-        <w:t>&lt;&lt;WAPhone&gt;&gt;</w:t>
+        <w:t>612-373-6900</w:t>
       </w:r>
       <w:r>
         <w:rPr>
@@ -895,7 +793,7 @@
         <w:rPr>
           <w:sz w:val="24"/>
         </w:rPr>
-        <w:t>&lt;&lt;paraName&gt;&gt;</w:t>
+        <w:t>Emily Bates</w:t>
       </w:r>
       <w:r>
         <w:rPr>
@@ -907,7 +805,7 @@
         <w:rPr>
           <w:sz w:val="24"/>
         </w:rPr>
-        <w:t>&lt;&lt;paraPhone&gt;&gt;</w:t>
+        <w:t>612-371-2163</w:t>
       </w:r>
       <w:r>
         <w:rPr>
@@ -1148,6 +1046,50 @@
     <w:lsdException w:name="Subtitle" w:qFormat="1"/>
     <w:lsdException w:name="Strong" w:qFormat="1"/>
     <w:lsdException w:name="Emphasis" w:qFormat="1"/>
+    <w:lsdException w:name="Normal Table" w:semiHidden="1" w:unhideWhenUsed="1"/>
+    <w:lsdException w:name="Table Simple 1" w:semiHidden="1" w:unhideWhenUsed="1"/>
+    <w:lsdException w:name="Table Simple 2" w:semiHidden="1" w:unhideWhenUsed="1"/>
+    <w:lsdException w:name="Table Simple 3" w:semiHidden="1" w:unhideWhenUsed="1"/>
+    <w:lsdException w:name="Table Classic 1" w:semiHidden="1" w:unhideWhenUsed="1"/>
+    <w:lsdException w:name="Table Classic 2" w:semiHidden="1" w:unhideWhenUsed="1"/>
+    <w:lsdException w:name="Table Classic 3" w:semiHidden="1" w:unhideWhenUsed="1"/>
+    <w:lsdException w:name="Table Classic 4" w:semiHidden="1" w:unhideWhenUsed="1"/>
+    <w:lsdException w:name="Table Colorful 1" w:semiHidden="1" w:unhideWhenUsed="1"/>
+    <w:lsdException w:name="Table Colorful 2" w:semiHidden="1" w:unhideWhenUsed="1"/>
+    <w:lsdException w:name="Table Colorful 3" w:semiHidden="1" w:unhideWhenUsed="1"/>
+    <w:lsdException w:name="Table Columns 1" w:semiHidden="1" w:unhideWhenUsed="1"/>
+    <w:lsdException w:name="Table Columns 2" w:semiHidden="1" w:unhideWhenUsed="1"/>
+    <w:lsdException w:name="Table Columns 3" w:semiHidden="1" w:unhideWhenUsed="1"/>
+    <w:lsdException w:name="Table Columns 4" w:semiHidden="1" w:unhideWhenUsed="1"/>
+    <w:lsdException w:name="Table Columns 5" w:semiHidden="1" w:unhideWhenUsed="1"/>
+    <w:lsdException w:name="Table Grid 1" w:semiHidden="1" w:unhideWhenUsed="1"/>
+    <w:lsdException w:name="Table Grid 2" w:semiHidden="1" w:unhideWhenUsed="1"/>
+    <w:lsdException w:name="Table Grid 3" w:semiHidden="1" w:unhideWhenUsed="1"/>
+    <w:lsdException w:name="Table Grid 4" w:semiHidden="1" w:unhideWhenUsed="1"/>
+    <w:lsdException w:name="Table Grid 5" w:semiHidden="1" w:unhideWhenUsed="1"/>
+    <w:lsdException w:name="Table Grid 6" w:semiHidden="1" w:unhideWhenUsed="1"/>
+    <w:lsdException w:name="Table Grid 7" w:semiHidden="1" w:unhideWhenUsed="1"/>
+    <w:lsdException w:name="Table Grid 8" w:semiHidden="1" w:unhideWhenUsed="1"/>
+    <w:lsdException w:name="Table List 1" w:semiHidden="1" w:unhideWhenUsed="1"/>
+    <w:lsdException w:name="Table List 2" w:semiHidden="1" w:unhideWhenUsed="1"/>
+    <w:lsdException w:name="Table List 3" w:semiHidden="1" w:unhideWhenUsed="1"/>
+    <w:lsdException w:name="Table List 4" w:semiHidden="1" w:unhideWhenUsed="1"/>
+    <w:lsdException w:name="Table List 5" w:semiHidden="1" w:unhideWhenUsed="1"/>
+    <w:lsdException w:name="Table List 6" w:semiHidden="1" w:unhideWhenUsed="1"/>
+    <w:lsdException w:name="Table List 7" w:semiHidden="1" w:unhideWhenUsed="1"/>
+    <w:lsdException w:name="Table List 8" w:semiHidden="1" w:unhideWhenUsed="1"/>
+    <w:lsdException w:name="Table 3D effects 1" w:semiHidden="1" w:unhideWhenUsed="1"/>
+    <w:lsdException w:name="Table 3D effects 2" w:semiHidden="1" w:unhideWhenUsed="1"/>
+    <w:lsdException w:name="Table 3D effects 3" w:semiHidden="1" w:unhideWhenUsed="1"/>
+    <w:lsdException w:name="Table Contemporary" w:semiHidden="1" w:unhideWhenUsed="1"/>
+    <w:lsdException w:name="Table Elegant" w:semiHidden="1" w:unhideWhenUsed="1"/>
+    <w:lsdException w:name="Table Professional" w:semiHidden="1" w:unhideWhenUsed="1"/>
+    <w:lsdException w:name="Table Subtle 1" w:semiHidden="1" w:unhideWhenUsed="1"/>
+    <w:lsdException w:name="Table Subtle 2" w:semiHidden="1" w:unhideWhenUsed="1"/>
+    <w:lsdException w:name="Table Web 1" w:semiHidden="1" w:unhideWhenUsed="1"/>
+    <w:lsdException w:name="Table Web 2" w:semiHidden="1" w:unhideWhenUsed="1"/>
+    <w:lsdException w:name="Table Web 3" w:semiHidden="1" w:unhideWhenUsed="1"/>
+    <w:lsdException w:name="Table Theme" w:semiHidden="1" w:unhideWhenUsed="1"/>
     <w:lsdException w:name="Placeholder Text" w:semiHidden="1" w:uiPriority="99"/>
     <w:lsdException w:name="No Spacing" w:uiPriority="1" w:qFormat="1"/>
     <w:lsdException w:name="Light Shading" w:uiPriority="60"/>
@@ -1385,11 +1327,15 @@
   </w:style>
   <w:style w:type="character" w:default="1" w:styleId="DefaultParagraphFont">
     <w:name w:val="Default Paragraph Font"/>
+    <w:uiPriority w:val="1"/>
     <w:semiHidden/>
+    <w:unhideWhenUsed/>
   </w:style>
   <w:style w:type="table" w:default="1" w:styleId="TableNormal">
     <w:name w:val="Normal Table"/>
+    <w:uiPriority w:val="99"/>
     <w:semiHidden/>
+    <w:unhideWhenUsed/>
     <w:tblPr>
       <w:tblInd w:w="0" w:type="dxa"/>
       <w:tblCellMar>
@@ -1402,7 +1348,9 @@
   </w:style>
   <w:style w:type="numbering" w:default="1" w:styleId="NoList">
     <w:name w:val="No List"/>
+    <w:uiPriority w:val="99"/>
     <w:semiHidden/>
+    <w:unhideWhenUsed/>
   </w:style>
   <w:style w:type="character" w:styleId="FootnoteReference">
     <w:name w:val="footnote reference"/>
@@ -1432,7 +1380,6 @@
   </w:style>
   <w:style w:type="character" w:styleId="CommentReference">
     <w:name w:val="annotation reference"/>
-    <w:basedOn w:val="DefaultParagraphFont"/>
     <w:rsid w:val="003251AB"/>
     <w:rPr>
       <w:sz w:val="16"/>
@@ -1478,7 +1425,6 @@
   </w:style>
   <w:style w:type="character" w:styleId="Hyperlink">
     <w:name w:val="Hyperlink"/>
-    <w:basedOn w:val="DefaultParagraphFont"/>
     <w:rsid w:val="008C7801"/>
     <w:rPr>
       <w:color w:val="0000FF"/>

</xml_diff>

<commit_message>
Worked on filling UI and database information for 'filerectreportNw2' merge.
</commit_message>
<xml_diff>
--- a/project/documents/merged/Document.docx
+++ b/project/documents/merged/Document.docx
@@ -245,6 +245,7 @@
         <w:rPr>
           <w:noProof/>
         </w:rPr>
+        <w:t>&lt;&lt;salutation&gt;&gt;</w:t>
       </w:r>
       <w:r>
         <w:t>:</w:t>
@@ -275,100 +276,36 @@
       </w:pPr>
     </w:p>
     <w:p>
-      <w:r>
-        <w:rPr>
-          <w:noProof/>
-        </w:rPr>
-        <w:t>ACTION BEING REPORTED:</w:t>
-      </w:r>
-      <w:r>
-        <w:rPr>
-          <w:noProof/>
-        </w:rPr>
-        <w:t xml:space="preserve"> </w:t>
-      </w:r>
-      <w:r>
-        <w:rPr>
-          <w:noProof/>
-        </w:rPr>
-        <w:t xml:space="preserve"> </w:t>
-      </w:r>
-      <w:r>
-        <w:t xml:space="preserve">Notice of Publication received from the United States Patent and Trademark Office that indicates the above-identified patent application has published with Publication Number </w:t>
-      </w:r>
-      <w:r/>
-      <w:r>
-        <w:t xml:space="preserve"> on </w:t>
-      </w:r>
-      <w:r>
-        <w:t>None</w:t>
-      </w:r>
-      <w:r>
-        <w:t>.</w:t>
-      </w:r>
-    </w:p>
-    <w:p>
-      <w:pPr>
-        <w:rPr>
-          <w:noProof/>
-        </w:rPr>
-      </w:pPr>
-    </w:p>
-    <w:p>
-      <w:pPr>
-        <w:rPr>
-          <w:noProof/>
-        </w:rPr>
-      </w:pPr>
-      <w:r>
-        <w:rPr>
-          <w:noProof/>
-        </w:rPr>
-        <w:t>ACTION REQUIRED: None at this time.</w:t>
-      </w:r>
-    </w:p>
-    <w:p>
-      <w:pPr>
-        <w:rPr>
-          <w:noProof/>
-        </w:rPr>
-      </w:pPr>
-    </w:p>
-    <w:p>
-      <w:r>
-        <w:rPr>
-          <w:noProof/>
-        </w:rPr>
-        <w:t xml:space="preserve">ADDITIONAL NOTES: </w:t>
-      </w:r>
-      <w:r>
-        <w:t>You may view the published application on-line after the publication date using the publication search database on the USPTO website (</w:t>
-      </w:r>
-      <w:hyperlink r:id="rId6" w:history="1">
-        <w:r>
-          <w:rPr>
-            <w:rStyle w:val="Hyperlink"/>
-          </w:rPr>
-          <w:t>www.uspto.gov</w:t>
-        </w:r>
-      </w:hyperlink>
-      <w:r>
-        <w:t>).</w:t>
-      </w:r>
-      <w:r>
-        <w:t xml:space="preserve">  </w:t>
-      </w:r>
-      <w:r>
-        <w:t xml:space="preserve">If you have any questions regarding this matter, please contact </w:t>
-      </w:r>
-      <w:r>
-        <w:rPr>
-          <w:noProof/>
-        </w:rPr>
-        <w:t>Attorney Test at 612-373-6900</w:t>
-      </w:r>
-      <w:r>
-        <w:t>.</w:t>
+      <w:pPr>
+        <w:rPr>
+          <w:noProof/>
+        </w:rPr>
+      </w:pPr>
+      <w:r>
+        <w:rPr>
+          <w:noProof/>
+        </w:rPr>
+        <w:t>ACTION BEING REPORTED:  Official Filing Receipt indicating the above-identified application was filed on August 21, 2023 under Serial No. 12/356,986.</w:t>
+      </w:r>
+    </w:p>
+    <w:p>
+      <w:pPr>
+        <w:rPr>
+          <w:noProof/>
+        </w:rPr>
+      </w:pPr>
+    </w:p>
+    <w:p>
+      <w:pPr>
+        <w:rPr>
+          <w:noProof/>
+        </w:rPr>
+      </w:pPr>
+      <w:r>
+        <w:rPr>
+          <w:noProof/>
+        </w:rPr>
+        <w:t xml:space="preserve">ADDITIONAL NOTES:  We have noted that the "Insert Incorrect Information Here" is incorrect and will file the necessary papers to correct this error in due course. We have also received a Notice of Acceptance. </w:t>
       </w:r>
     </w:p>
     <w:p>
@@ -478,8 +415,8 @@
     </w:tbl>
     <w:p/>
     <w:sectPr>
-      <w:headerReference w:type="default" r:id="rId7"/>
-      <w:footerReference w:type="default" r:id="rId10"/>
+      <w:headerReference w:type="default" r:id="rId6"/>
+      <w:footerReference w:type="default" r:id="rId9"/>
       <w:pgSz w:w="12240" w:h="15840" w:code="1"/>
       <w:pgMar w:top="1872" w:right="1440" w:bottom="1440" w:left="1440" w:header="619" w:footer="619" w:gutter="0"/>
       <w:cols w:space="720"/>
@@ -872,7 +809,6 @@
   </w:style>
   <w:style w:type="character" w:styleId="CommentReference">
     <w:name w:val="annotation reference"/>
-    <w:basedOn w:val="DefaultParagraphFont"/>
     <w:semiHidden/>
     <w:rsid w:val="0055512A"/>
     <w:rPr>
@@ -899,15 +835,6 @@
     <w:rPr>
       <w:b/>
       <w:bCs/>
-    </w:rPr>
-  </w:style>
-  <w:style w:type="character" w:styleId="Hyperlink">
-    <w:name w:val="Hyperlink"/>
-    <w:basedOn w:val="DefaultParagraphFont"/>
-    <w:rsid w:val="00864496"/>
-    <w:rPr>
-      <w:color w:val="0000FF"/>
-      <w:u w:val="single"/>
     </w:rPr>
   </w:style>
 </w:styles>

</xml_diff>

<commit_message>
Nearly completed 'recordation' merge function.
</commit_message>
<xml_diff>
--- a/project/documents/merged/Document.docx
+++ b/project/documents/merged/Document.docx
@@ -607,7 +607,7 @@
           <w:rFonts w:ascii="Times New Roman" w:hAnsi="Times New Roman"/>
           <w:sz w:val="22"/>
         </w:rPr>
-        <w:t>Previous Client/Matter Number: SLW Reassignment</w:t>
+        <w:t>Wiley E. Coyote</w:t>
       </w:r>
       <w:r>
         <w:rPr>
@@ -798,7 +798,7 @@
           <w:szCs w:val="16"/>
           <w:u w:val="single"/>
         </w:rPr>
-        <w:t xml:space="preserve">             </w:t>
+        <w:t xml:space="preserve"> November 12, 2024            </w:t>
       </w:r>
     </w:p>
     <w:p>
@@ -3303,7 +3303,7 @@
           <w:szCs w:val="16"/>
           <w:u w:val="single"/>
         </w:rPr>
-        <w:t>1</w:t>
+        <w:t>8</w:t>
       </w:r>
       <w:r>
         <w:rPr>

</xml_diff>

<commit_message>
Added sign-off to email merges.
</commit_message>
<xml_diff>
--- a/project/documents/merged/Document.docx
+++ b/project/documents/merged/Document.docx
@@ -4,7 +4,7 @@
   <w:body>
     <w:p>
       <w:r>
-        <w:t xml:space="preserve">Subject line: ACME Manufacturing  / SLW Ref: 1.003US1 / SLW Report out: </w:t>
+        <w:t xml:space="preserve">Subject line: ACME Manufacturing Ref. No. Pa Da / SLW Ref: 1.003US1 / SLW Report out: </w:t>
       </w:r>
     </w:p>
     <w:p>
@@ -53,7 +53,7 @@
       </w:r>
       <w:r>
         <w:tab/>
-        <w:t>ACME Manufacturing  - SLW Ref. No. 1.003US1</w:t>
+        <w:t>ACME Manufacturing Ref. No. Pa Da - SLW Ref. No. 1.003US1</w:t>
       </w:r>
     </w:p>
     <w:p>
@@ -222,6 +222,59 @@
       </w:pPr>
       <w:r>
         <w:t>If you have any questions regarding the attached patent or the possibility of filing a reissue application, please contact Attorney Test at 612-373-6900.</w:t>
+      </w:r>
+    </w:p>
+    <w:p>
+      <w:r>
+        <w:t xml:space="preserve">Reported By: </w:t>
+      </w:r>
+    </w:p>
+    <w:p/>
+    <w:p>
+      <w:r>
+        <w:t>Caitlin E.. Puckett</w:t>
+      </w:r>
+    </w:p>
+    <w:p>
+      <w:r>
+        <w:t xml:space="preserve">Case Management Assistant </w:t>
+      </w:r>
+    </w:p>
+    <w:p/>
+    <w:p>
+      <w:r>
+        <w:t xml:space="preserve">Attachments </w:t>
+      </w:r>
+    </w:p>
+    <w:p>
+      <w:r>
+        <w:t xml:space="preserve">This electronic transmission contains information which is confidential and/or privileged. The information is intended for use only by the individual or entity named above. If you are not the intended recipient (or the employee or agent responsible for delivering this information to the intended recipient), you are hereby notified that any use, dissemination, distribution, or copying of this communication is prohibited. If you have received this information in error, please notify me immediately by telephone at 612-373-6900 or by electronic mail and delete all copies of the transmission. Thank you.      </w:t>
+      </w:r>
+    </w:p>
+    <w:p/>
+    <w:p>
+      <w:r>
+        <w:t xml:space="preserve">Schwegman Lundberg &amp; Woessner, P.A  </w:t>
+      </w:r>
+    </w:p>
+    <w:p>
+      <w:r>
+        <w:t xml:space="preserve">1600 TCF Tower, 121 South Eighth Street, Minneapolis, MN 55402  </w:t>
+      </w:r>
+    </w:p>
+    <w:p>
+      <w:r>
+        <w:t xml:space="preserve">Telephone: (612) 373-6900  </w:t>
+      </w:r>
+    </w:p>
+    <w:p>
+      <w:r>
+        <w:t xml:space="preserve">Fax: (612) 339-3061  </w:t>
+      </w:r>
+    </w:p>
+    <w:p>
+      <w:r>
+        <w:t>Web site: www.slwip.com</w:t>
       </w:r>
     </w:p>
     <w:sectPr>

</xml_diff>

<commit_message>
Worked on 'rptissuefee' merge method.
</commit_message>
<xml_diff>
--- a/project/documents/merged/Document.docx
+++ b/project/documents/merged/Document.docx
@@ -3,226 +3,282 @@
 <w:document xmlns:wpc="http://schemas.microsoft.com/office/word/2010/wordprocessingCanvas" xmlns:cx="http://schemas.microsoft.com/office/drawing/2014/chartex" xmlns:cx1="http://schemas.microsoft.com/office/drawing/2015/9/8/chartex" xmlns:cx2="http://schemas.microsoft.com/office/drawing/2015/10/21/chartex" xmlns:cx3="http://schemas.microsoft.com/office/drawing/2016/5/9/chartex" xmlns:cx4="http://schemas.microsoft.com/office/drawing/2016/5/10/chartex" xmlns:cx5="http://schemas.microsoft.com/office/drawing/2016/5/11/chartex" xmlns:cx6="http://schemas.microsoft.com/office/drawing/2016/5/12/chartex" xmlns:cx7="http://schemas.microsoft.com/office/drawing/2016/5/13/chartex" xmlns:cx8="http://schemas.microsoft.com/office/drawing/2016/5/14/chartex" xmlns:mc="http://schemas.openxmlformats.org/markup-compatibility/2006" xmlns:aink="http://schemas.microsoft.com/office/drawing/2016/ink" xmlns:am3d="http://schemas.microsoft.com/office/drawing/2017/model3d" xmlns:o="urn:schemas-microsoft-com:office:office" xmlns:oel="http://schemas.microsoft.com/office/2019/extlst" xmlns:r="http://schemas.openxmlformats.org/officeDocument/2006/relationships" xmlns:m="http://schemas.openxmlformats.org/officeDocument/2006/math" xmlns:v="urn:schemas-microsoft-com:vml" xmlns:wp14="http://schemas.microsoft.com/office/word/2010/wordprocessingDrawing" xmlns:wp="http://schemas.openxmlformats.org/drawingml/2006/wordprocessingDrawing" xmlns:w10="urn:schemas-microsoft-com:office:word" xmlns:w="http://schemas.openxmlformats.org/wordprocessingml/2006/main" xmlns:w14="http://schemas.microsoft.com/office/word/2010/wordml" xmlns:w15="http://schemas.microsoft.com/office/word/2012/wordml" xmlns:w16cex="http://schemas.microsoft.com/office/word/2018/wordml/cex" xmlns:w16cid="http://schemas.microsoft.com/office/word/2016/wordml/cid" xmlns:w16="http://schemas.microsoft.com/office/word/2018/wordml" xmlns:w16sdtdh="http://schemas.microsoft.com/office/word/2020/wordml/sdtdatahash" xmlns:w16se="http://schemas.microsoft.com/office/word/2015/wordml/symex" xmlns:wpg="http://schemas.microsoft.com/office/word/2010/wordprocessingGroup" xmlns:wpi="http://schemas.microsoft.com/office/word/2010/wordprocessingInk" xmlns:wne="http://schemas.microsoft.com/office/word/2006/wordml" xmlns:wps="http://schemas.microsoft.com/office/word/2010/wordprocessingShape" mc:Ignorable="w14 w15 w16se w16cid w16 w16cex w16sdtdh wp14">
   <w:body>
     <w:p>
-      <w:r>
-        <w:t xml:space="preserve">Subject line: ACME Manufacturing Ref. No. Pa Da / SLW Ref: 1.003US1 / SLW Report out: </w:t>
-      </w:r>
-    </w:p>
-    <w:p>
-      <w:pPr>
-        <w:pStyle w:val="NormalWeb"/>
-      </w:pPr>
-      <w:r>
-        <w:t>Body of email:</w:t>
-      </w:r>
-    </w:p>
-    <w:p>
-      <w:pPr>
-        <w:pStyle w:val="NormalWeb"/>
-      </w:pPr>
-      <w:r>
-        <w:t xml:space="preserve">SCHWEGMAN LUNDBERG &amp; WOESSNER, P.A. </w:t>
+      <w:pPr>
+        <w:pStyle w:val="NormalWeb"/>
+        <w:spacing w:before="0" w:beforeAutospacing="0" w:after="0" w:afterAutospacing="0"/>
+      </w:pPr>
+      <w:r>
+        <w:t xml:space="preserve">Subject line: </w:t>
+      </w:r>
+      <w:r>
+        <w:t xml:space="preserve">$Burns$ Industries - Springfield: Ref. No. Pa Da / SLW Ref: 1.003US1 / </w:t>
+      </w:r>
+      <w:r>
+        <w:t>SLW</w:t>
+      </w:r>
+      <w:r>
+        <w:t xml:space="preserve"> Report Out: Issue Fee filed</w:t>
+      </w:r>
+    </w:p>
+    <w:p>
+      <w:pPr>
+        <w:pStyle w:val="NormalWeb"/>
+        <w:spacing w:before="0" w:beforeAutospacing="0" w:after="0" w:afterAutospacing="0"/>
+      </w:pPr>
+    </w:p>
+    <w:p>
+      <w:pPr>
+        <w:pStyle w:val="NormalWeb"/>
+        <w:spacing w:before="0" w:beforeAutospacing="0" w:after="0" w:afterAutospacing="0"/>
+      </w:pPr>
+    </w:p>
+    <w:p>
+      <w:pPr>
+        <w:pStyle w:val="NormalWeb"/>
+        <w:spacing w:before="0" w:beforeAutospacing="0" w:after="0" w:afterAutospacing="0"/>
+      </w:pPr>
+    </w:p>
+    <w:p>
+      <w:pPr>
+        <w:pStyle w:val="NormalWeb"/>
+        <w:spacing w:before="0" w:beforeAutospacing="0" w:after="0" w:afterAutospacing="0"/>
+      </w:pPr>
+      <w:r>
+        <w:t>Body:</w:t>
+      </w:r>
+    </w:p>
+    <w:p>
+      <w:pPr>
+        <w:pStyle w:val="NormalWeb"/>
+        <w:spacing w:before="0" w:beforeAutospacing="0" w:after="0" w:afterAutospacing="0"/>
+      </w:pPr>
+    </w:p>
+    <w:p>
+      <w:pPr>
+        <w:pStyle w:val="NormalWeb"/>
+        <w:spacing w:before="0" w:beforeAutospacing="0" w:after="0" w:afterAutospacing="0"/>
+      </w:pPr>
+      <w:r>
+        <w:t>Schwegman Lundberg &amp; Woessner, P.A.</w:t>
+      </w:r>
+      <w:r/>
+      <w:r/>
+    </w:p>
+    <w:p>
+      <w:pPr>
+        <w:pStyle w:val="NormalWeb"/>
+        <w:spacing w:before="0" w:beforeAutospacing="0" w:after="0" w:afterAutospacing="0"/>
+      </w:pPr>
+    </w:p>
+    <w:p>
+      <w:pPr>
+        <w:pStyle w:val="NormalWeb"/>
+        <w:spacing w:before="0" w:beforeAutospacing="0" w:after="0" w:afterAutospacing="0"/>
+      </w:pPr>
+      <w:r>
+        <w:t>Attorney Test</w:t>
+      </w:r>
+      <w:r/>
+      <w:r>
+        <w:t xml:space="preserve"> 612-373-6900</w:t>
+      </w:r>
+      <w:r/>
+      <w:r/>
+      <w:proofErr w:type="gramStart"/>
+      <w:r>
+        <w:t xml:space="preserve">  mmartin@slwip.com</w:t>
+      </w:r>
+      <w:r/>
+      <w:r/>
+      <w:proofErr w:type="gramEnd"/>
+      <w:r/>
+    </w:p>
+    <w:p>
+      <w:pPr>
+        <w:pStyle w:val="NormalWeb"/>
+        <w:spacing w:before="0" w:beforeAutospacing="0" w:after="0" w:afterAutospacing="0"/>
+      </w:pPr>
+      <w:r>
+        <w:t>Emily Bates</w:t>
+      </w:r>
+      <w:r/>
+      <w:r>
+        <w:t xml:space="preserve"> 612-371-2163</w:t>
+      </w:r>
+      <w:r/>
+      <w:r/>
+      <w:proofErr w:type="gramStart"/>
+      <w:r>
+        <w:t xml:space="preserve">  ebates@slwip.com</w:t>
+      </w:r>
+      <w:r/>
+      <w:r/>
+      <w:proofErr w:type="gramEnd"/>
+      <w:r/>
+    </w:p>
+    <w:p>
+      <w:pPr>
+        <w:pStyle w:val="NormalWeb"/>
+        <w:spacing w:before="0" w:beforeAutospacing="0" w:after="0" w:afterAutospacing="0"/>
+      </w:pPr>
+    </w:p>
+    <w:p>
+      <w:pPr>
+        <w:pStyle w:val="NormalWeb"/>
+        <w:spacing w:before="0" w:beforeAutospacing="0" w:after="0" w:afterAutospacing="0"/>
+      </w:pPr>
+      <w:proofErr w:type="gramStart"/>
+      <w:r>
+        <w:t>Re:</w:t>
+      </w:r>
+      <w:r>
+        <w:tab/>
+        <w:t>$Burns$ Industries - Springfield</w:t>
+      </w:r>
+      <w:r/>
+      <w:r/>
+      <w:proofErr w:type="gramEnd"/>
+      <w:r>
+        <w:t xml:space="preserve"> Ref. No. Pa Da</w:t>
+      </w:r>
+      <w:r/>
+      <w:r>
+        <w:t xml:space="preserve"> - SLW Ref. No. 1.003US1</w:t>
+      </w:r>
+      <w:r/>
+      <w:r/>
+    </w:p>
+    <w:p>
+      <w:pPr>
+        <w:pStyle w:val="NormalWeb"/>
+        <w:spacing w:before="0" w:beforeAutospacing="0" w:after="0" w:afterAutospacing="0"/>
+      </w:pPr>
+      <w:r>
+        <w:tab/>
+        <w:t>Patent Application Serial No.: 12/356,986</w:t>
+      </w:r>
+      <w:r/>
+      <w:r>
+        <w:t>, filed August 21, 2023</w:t>
+      </w:r>
+      <w:r/>
+      <w:r/>
+    </w:p>
+    <w:p>
+      <w:pPr>
+        <w:pStyle w:val="NormalWeb"/>
+        <w:spacing w:before="0" w:beforeAutospacing="0" w:after="0" w:afterAutospacing="0"/>
+      </w:pPr>
+      <w:r>
+        <w:tab/>
+        <w:t>Title:  Method and apparatus for making a title for a matter 1000</w:t>
+      </w:r>
+      <w:r/>
+      <w:r/>
+    </w:p>
+    <w:p>
+      <w:pPr>
+        <w:pStyle w:val="NormalWeb"/>
+        <w:spacing w:before="0" w:beforeAutospacing="0" w:after="0" w:afterAutospacing="0"/>
+      </w:pPr>
+    </w:p>
+    <w:p>
+      <w:pPr>
+        <w:pStyle w:val="NormalWeb"/>
+        <w:spacing w:before="0" w:beforeAutospacing="0" w:after="0" w:afterAutospacing="0"/>
+      </w:pPr>
+      <w:r>
+        <w:t xml:space="preserve">The following represents new activity on the </w:t>
+      </w:r>
+      <w:proofErr w:type="gramStart"/>
+      <w:r>
+        <w:t>above mentioned</w:t>
+      </w:r>
+      <w:proofErr w:type="gramEnd"/>
+      <w:r>
+        <w:t xml:space="preserve"> matter.</w:t>
+      </w:r>
+    </w:p>
+    <w:p>
+      <w:pPr>
+        <w:pStyle w:val="NormalWeb"/>
+        <w:spacing w:before="0" w:beforeAutospacing="0" w:after="0" w:afterAutospacing="0"/>
+      </w:pPr>
+      <w:r>
+        <w:t xml:space="preserve">     </w:t>
+      </w:r>
+      <w:r>
+        <w:br/>
+        <w:t xml:space="preserve">INFORMATION BEING REPORTED:  </w:t>
+      </w:r>
+      <w:r>
+        <w:t xml:space="preserve">We are pleased to report that the issue fee was paid for this application on </w:t>
+      </w:r>
+      <w:r/>
+      <w:r>
+        <w:t>. A copy of our submission to the USPTO is attached for your reference.</w:t>
+      </w:r>
+    </w:p>
+    <w:p>
+      <w:pPr>
+        <w:pStyle w:val="NormalWeb"/>
+        <w:spacing w:before="0" w:beforeAutospacing="0" w:after="0" w:afterAutospacing="0"/>
+      </w:pPr>
+    </w:p>
+    <w:p>
+      <w:pPr>
+        <w:pStyle w:val="NormalWeb"/>
+        <w:spacing w:before="0" w:beforeAutospacing="0" w:after="0" w:afterAutospacing="0"/>
+      </w:pPr>
+      <w:r>
+        <w:rPr>
+          <w:highlight w:val="yellow"/>
+        </w:rPr>
+        <w:t xml:space="preserve">ACTION NEEDED: </w:t>
+      </w:r>
+      <w:r>
+        <w:rPr>
+          <w:color w:val="000000"/>
+          <w:highlight w:val="yellow"/>
+        </w:rPr>
+        <w:t>Please instruct us as to whether any continuing application filing is desired.</w:t>
+      </w:r>
+    </w:p>
+    <w:p>
+      <w:pPr>
+        <w:pStyle w:val="NormalWeb"/>
+        <w:spacing w:before="0" w:beforeAutospacing="0" w:after="0" w:afterAutospacing="0"/>
+      </w:pPr>
+    </w:p>
+    <w:p>
+      <w:pPr>
+        <w:pStyle w:val="NormalWeb"/>
+        <w:spacing w:before="0" w:beforeAutospacing="0" w:after="0" w:afterAutospacing="0"/>
+      </w:pPr>
+      <w:r>
+        <w:t>ADDITIONAL NOTES:  If you have any questions or comments, please contact Attorney Test</w:t>
+      </w:r>
+      <w:r/>
+      <w:r>
+        <w:t xml:space="preserve"> at 612-373-6900</w:t>
+      </w:r>
+      <w:r/>
+      <w:r>
+        <w:t xml:space="preserve"> or Emily Bates</w:t>
+      </w:r>
+      <w:r/>
+      <w:r>
+        <w:t xml:space="preserve"> at 612-371-2163</w:t>
+      </w:r>
+      <w:r/>
+      <w:r>
+        <w:t>.</w:t>
       </w:r>
     </w:p>
     <w:p>
       <w:pPr>
         <w:spacing w:after="0" w:line="240" w:lineRule="auto"/>
       </w:pPr>
-      <w:r>
-        <w:t>Attorney Test 612-373-6900  mmartin@slwip.com</w:t>
-      </w:r>
-    </w:p>
-    <w:p>
-      <w:pPr>
-        <w:spacing w:after="0" w:line="240" w:lineRule="auto"/>
-      </w:pPr>
-      <w:r>
-        <w:t>Emily Bates 612-371-2163  ebates@slwip.com</w:t>
-      </w:r>
-    </w:p>
-    <w:p>
-      <w:pPr>
-        <w:spacing w:after="0" w:line="240" w:lineRule="auto"/>
-      </w:pPr>
-    </w:p>
-    <w:p>
-      <w:pPr>
-        <w:spacing w:after="0" w:line="240" w:lineRule="auto"/>
-      </w:pPr>
-      <w:r>
-        <w:t>Re:</w:t>
-      </w:r>
-      <w:r>
-        <w:tab/>
-        <w:t>ACME Manufacturing Ref. No. Pa Da - SLW Ref. No. 1.003US1</w:t>
-      </w:r>
-    </w:p>
-    <w:p>
-      <w:pPr>
-        <w:spacing w:after="0" w:line="240" w:lineRule="auto"/>
-        <w:ind w:firstLine="720"/>
-      </w:pPr>
-      <w:r>
-        <w:t>Patent Application Serial No. 12/356,986, filed August 21, 2023</w:t>
-      </w:r>
-    </w:p>
-    <w:p>
-      <w:pPr>
-        <w:spacing w:after="0" w:line="240" w:lineRule="auto"/>
-        <w:ind w:firstLine="720"/>
-      </w:pPr>
-      <w:r>
-        <w:rPr>
-          <w:rFonts w:cstheme="minorHAnsi"/>
-          <w:color w:val="000000"/>
-        </w:rPr>
-        <w:t>U.S. Patent No. , issued None</w:t>
-      </w:r>
-    </w:p>
-    <w:p>
-      <w:pPr>
-        <w:spacing w:after="0" w:line="240" w:lineRule="auto"/>
-        <w:ind w:firstLine="720"/>
-      </w:pPr>
-      <w:r>
-        <w:t>Title: Method and apparatus for making a title for a matter 1000</w:t>
-      </w:r>
-    </w:p>
-    <w:p>
-      <w:pPr>
-        <w:spacing w:after="0" w:line="240" w:lineRule="auto"/>
-      </w:pPr>
-    </w:p>
-    <w:p>
-      <w:pPr>
-        <w:spacing w:after="0" w:line="240" w:lineRule="auto"/>
-      </w:pPr>
-      <w:r>
-        <w:t xml:space="preserve">We are pleased to attach an electronic copy of United States Letters Patent No.  issued None and entitled "Method and apparatus for making a title for a matter 1000".   </w:t>
-      </w:r>
-    </w:p>
-    <w:p>
-      <w:pPr>
-        <w:spacing w:after="0" w:line="240" w:lineRule="auto"/>
-      </w:pPr>
-    </w:p>
-    <w:p>
-      <w:pPr>
-        <w:spacing w:after="0" w:line="240" w:lineRule="auto"/>
-      </w:pPr>
-      <w:r/>
-    </w:p>
-    <w:p>
-      <w:pPr>
-        <w:spacing w:after="0" w:line="240" w:lineRule="auto"/>
-      </w:pPr>
-    </w:p>
-    <w:p>
-      <w:pPr>
-        <w:spacing w:after="0" w:line="240" w:lineRule="auto"/>
-      </w:pPr>
-      <w:r>
-        <w:t>The patent will remain in effect for a term of twenty years from the date of the earliest filing.  To maintain the patent for its entire term, maintenance fees must be paid when due.  The fees are due as follows:</w:t>
-      </w:r>
-    </w:p>
-    <w:p>
-      <w:pPr>
-        <w:spacing w:after="0" w:line="240" w:lineRule="auto"/>
-      </w:pPr>
-    </w:p>
-    <w:p>
-      <w:pPr>
-        <w:spacing w:after="0" w:line="240" w:lineRule="auto"/>
-      </w:pPr>
-      <w:r>
-        <w:tab/>
-      </w:r>
-      <w:r>
-        <w:tab/>
-      </w:r>
-      <w:r>
-        <w:tab/>
-        <w:t>3-1/2 years from the issue date</w:t>
-      </w:r>
-    </w:p>
-    <w:p>
-      <w:pPr>
-        <w:spacing w:after="0" w:line="240" w:lineRule="auto"/>
-      </w:pPr>
-      <w:r>
-        <w:tab/>
-      </w:r>
-      <w:r>
-        <w:tab/>
-      </w:r>
-      <w:r>
-        <w:tab/>
-        <w:t>7-1/2 years from the issue date</w:t>
-      </w:r>
-    </w:p>
-    <w:p>
-      <w:pPr>
-        <w:spacing w:after="0" w:line="240" w:lineRule="auto"/>
-      </w:pPr>
-      <w:r>
-        <w:tab/>
-      </w:r>
-      <w:r>
-        <w:tab/>
-      </w:r>
-      <w:r>
-        <w:tab/>
-        <w:t>11-1/2 years from the issue date</w:t>
-      </w:r>
-    </w:p>
-    <w:p>
-      <w:pPr>
-        <w:spacing w:after="0" w:line="240" w:lineRule="auto"/>
-      </w:pPr>
-    </w:p>
-    <w:p>
-      <w:pPr>
-        <w:spacing w:after="0" w:line="240" w:lineRule="auto"/>
-      </w:pPr>
-      <w:r/>
-    </w:p>
-    <w:p>
-      <w:pPr>
-        <w:spacing w:after="0" w:line="240" w:lineRule="auto"/>
-      </w:pPr>
-    </w:p>
-    <w:p>
-      <w:pPr>
-        <w:spacing w:after="0" w:line="240" w:lineRule="auto"/>
-      </w:pPr>
-      <w:r>
-        <w:t xml:space="preserve">Additionally, please note that any request for broadening the claims of your patent via reissue must be made within two (2) years of issuance of the patent.  Broadening reissue applications are filed for a number of reasons and may be used to correct claim scope when it is determined that the issued claims are narrower than what is thought to be allowable.  Once this deadline passes, the only kind of reissue application possible is one where the scope of the claims remains the same or is reduced.  Please contact us if you would like to discuss the possibility of filing a reissue application based on the above patent.  However, we will not send any further reminders regarding the deadline to file a broadening reissue application, and will take no further action unless instructed to do so in writing. </w:t>
-      </w:r>
-    </w:p>
-    <w:p>
-      <w:pPr>
-        <w:spacing w:after="0" w:line="240" w:lineRule="auto"/>
-      </w:pPr>
-    </w:p>
-    <w:p>
-      <w:pPr>
-        <w:spacing w:after="0" w:line="240" w:lineRule="auto"/>
-      </w:pPr>
-      <w:r>
-        <w:t xml:space="preserve">We are pleased to have been of service in helping to secure the issuance of the attached Letters Patent and consider our representation before the USPTO in the above-referenced matter to be completed and are therefore closing our file. We will of course inform you of any future correspondence received in relation to your patent.   </w:t>
-      </w:r>
-    </w:p>
-    <w:p>
-      <w:pPr>
-        <w:spacing w:after="0" w:line="240" w:lineRule="auto"/>
-      </w:pPr>
-    </w:p>
-    <w:p>
-      <w:pPr>
-        <w:spacing w:after="0" w:line="240" w:lineRule="auto"/>
-      </w:pPr>
-      <w:r>
-        <w:t>If you have any questions regarding the attached patent or the possibility of filing a reissue application, please contact Attorney Test at 612-373-6900.</w:t>
-      </w:r>
     </w:p>
     <w:p>
       <w:r>
@@ -232,7 +288,7 @@
     <w:p/>
     <w:p>
       <w:r>
-        <w:t>Caitlin E.. Puckett</w:t>
+        <w:t>Caitlin E. Puckett</w:t>
       </w:r>
     </w:p>
     <w:p>
@@ -741,7 +797,7 @@
     <w:uiPriority w:val="99"/>
     <w:semiHidden/>
     <w:unhideWhenUsed/>
-    <w:rsid w:val="00BD72B7"/>
+    <w:rsid w:val="0076024A"/>
     <w:pPr>
       <w:spacing w:before="100" w:beforeAutospacing="1" w:after="100" w:afterAutospacing="1" w:line="240" w:lineRule="auto"/>
     </w:pPr>

</xml_diff>

<commit_message>
Worked on 'basicreport' merge.
</commit_message>
<xml_diff>
--- a/project/documents/merged/Document.docx
+++ b/project/documents/merged/Document.docx
@@ -3,85 +3,60 @@
 <w:document xmlns:wpc="http://schemas.microsoft.com/office/word/2010/wordprocessingCanvas" xmlns:cx="http://schemas.microsoft.com/office/drawing/2014/chartex" xmlns:cx1="http://schemas.microsoft.com/office/drawing/2015/9/8/chartex" xmlns:cx2="http://schemas.microsoft.com/office/drawing/2015/10/21/chartex" xmlns:cx3="http://schemas.microsoft.com/office/drawing/2016/5/9/chartex" xmlns:cx4="http://schemas.microsoft.com/office/drawing/2016/5/10/chartex" xmlns:cx5="http://schemas.microsoft.com/office/drawing/2016/5/11/chartex" xmlns:cx6="http://schemas.microsoft.com/office/drawing/2016/5/12/chartex" xmlns:cx7="http://schemas.microsoft.com/office/drawing/2016/5/13/chartex" xmlns:cx8="http://schemas.microsoft.com/office/drawing/2016/5/14/chartex" xmlns:mc="http://schemas.openxmlformats.org/markup-compatibility/2006" xmlns:aink="http://schemas.microsoft.com/office/drawing/2016/ink" xmlns:am3d="http://schemas.microsoft.com/office/drawing/2017/model3d" xmlns:o="urn:schemas-microsoft-com:office:office" xmlns:oel="http://schemas.microsoft.com/office/2019/extlst" xmlns:r="http://schemas.openxmlformats.org/officeDocument/2006/relationships" xmlns:m="http://schemas.openxmlformats.org/officeDocument/2006/math" xmlns:v="urn:schemas-microsoft-com:vml" xmlns:wp14="http://schemas.microsoft.com/office/word/2010/wordprocessingDrawing" xmlns:wp="http://schemas.openxmlformats.org/drawingml/2006/wordprocessingDrawing" xmlns:w10="urn:schemas-microsoft-com:office:word" xmlns:w="http://schemas.openxmlformats.org/wordprocessingml/2006/main" xmlns:w14="http://schemas.microsoft.com/office/word/2010/wordml" xmlns:w15="http://schemas.microsoft.com/office/word/2012/wordml" xmlns:w16cex="http://schemas.microsoft.com/office/word/2018/wordml/cex" xmlns:w16cid="http://schemas.microsoft.com/office/word/2016/wordml/cid" xmlns:w16="http://schemas.microsoft.com/office/word/2018/wordml" xmlns:w16sdtdh="http://schemas.microsoft.com/office/word/2020/wordml/sdtdatahash" xmlns:w16se="http://schemas.microsoft.com/office/word/2015/wordml/symex" xmlns:wpg="http://schemas.microsoft.com/office/word/2010/wordprocessingGroup" xmlns:wpi="http://schemas.microsoft.com/office/word/2010/wordprocessingInk" xmlns:wne="http://schemas.microsoft.com/office/word/2006/wordml" xmlns:wps="http://schemas.microsoft.com/office/word/2010/wordprocessingShape" mc:Ignorable="w14 w15 w16se w16cid w16 w16cex w16sdtdh wp14">
   <w:body>
     <w:p>
+      <w:bookmarkStart w:id="0" w:name="OLE_LINK1"/>
+      <w:bookmarkStart w:id="1" w:name="OLE_LINK2"/>
+      <w:r>
+        <w:t>Subject line: ACME Manufacturing Ref. No. Pa Da / SLW Ref: 1.003US1 / SLW</w:t>
+      </w:r>
+      <w:r>
+        <w:t xml:space="preserve"> </w:t>
+      </w:r>
+      <w:r>
+        <w:t>Report out: NAPD-D Final Date|Notice of Appeal Due - Final Deadline 10/02/2024;SIDS-D Due Date|Supplemental IDS Due 07/18/2024</w:t>
+      </w:r>
+    </w:p>
+    <w:p>
       <w:pPr>
         <w:pStyle w:val="NormalWeb"/>
-        <w:spacing w:before="0" w:beforeAutospacing="0" w:after="0" w:afterAutospacing="0"/>
-      </w:pPr>
-      <w:r>
-        <w:t xml:space="preserve">Subject line: ACME Manufacturing: Ref. No. Pa Da / SLW Ref: 1.003US1 / </w:t>
-      </w:r>
-      <w:r>
-        <w:t>SLW</w:t>
-      </w:r>
-      <w:r>
-        <w:t xml:space="preserve"> Report Out: </w:t>
-      </w:r>
-      <w:r>
-        <w:t>Filing Receipt Received</w:t>
+      </w:pPr>
+      <w:r>
+        <w:t>Body of email:</w:t>
       </w:r>
     </w:p>
     <w:p>
       <w:pPr>
         <w:pStyle w:val="NormalWeb"/>
-        <w:spacing w:before="0" w:beforeAutospacing="0" w:after="0" w:afterAutospacing="0"/>
       </w:pPr>
     </w:p>
     <w:p>
       <w:pPr>
         <w:pStyle w:val="NormalWeb"/>
-        <w:spacing w:before="0" w:beforeAutospacing="0" w:after="0" w:afterAutospacing="0"/>
       </w:pPr>
     </w:p>
     <w:p>
       <w:pPr>
         <w:pStyle w:val="NormalWeb"/>
-        <w:spacing w:before="0" w:beforeAutospacing="0" w:after="0" w:afterAutospacing="0"/>
       </w:pPr>
     </w:p>
     <w:p>
       <w:pPr>
         <w:pStyle w:val="NormalWeb"/>
-        <w:spacing w:before="0" w:beforeAutospacing="0" w:after="0" w:afterAutospacing="0"/>
-      </w:pPr>
-      <w:r>
-        <w:t>Body:</w:t>
+      </w:pPr>
+      <w:r>
+        <w:t xml:space="preserve">SCHWEGMAN LUNDBERG &amp; WOESSNER, P.A. </w:t>
       </w:r>
     </w:p>
     <w:p>
       <w:pPr>
         <w:pStyle w:val="NormalWeb"/>
-        <w:spacing w:before="0" w:beforeAutospacing="0" w:after="0" w:afterAutospacing="0"/>
-      </w:pPr>
-    </w:p>
-    <w:p>
-      <w:pPr>
-        <w:pStyle w:val="NormalWeb"/>
-        <w:spacing w:before="0" w:beforeAutospacing="0" w:after="0" w:afterAutospacing="0"/>
-      </w:pPr>
-      <w:r>
-        <w:t>Schwegman Lundberg &amp; Woessner, P.A.</w:t>
-      </w:r>
-    </w:p>
-    <w:p>
-      <w:pPr>
-        <w:pStyle w:val="NormalWeb"/>
-        <w:spacing w:before="0" w:beforeAutospacing="0" w:after="0" w:afterAutospacing="0"/>
-      </w:pPr>
-    </w:p>
-    <w:p>
-      <w:pPr>
-        <w:pStyle w:val="NormalWeb"/>
-        <w:spacing w:before="0" w:beforeAutospacing="0" w:after="0" w:afterAutospacing="0"/>
-      </w:pPr>
+      </w:pPr>
+    </w:p>
+    <w:p>
       <w:r>
         <w:t>Attorney Test 612-373-6900  mmartin@slwip.com</w:t>
       </w:r>
     </w:p>
     <w:p>
-      <w:pPr>
-        <w:pStyle w:val="NormalWeb"/>
-        <w:spacing w:before="0" w:beforeAutospacing="0" w:after="0" w:afterAutospacing="0"/>
-      </w:pPr>
       <w:r>
         <w:t>Emily Bates 612-371-2163  ebates@slwip.com</w:t>
       </w:r>
@@ -208,74 +183,120 @@
         </w:rPr>
       </w:pPr>
       <w:r>
-        <w:t xml:space="preserve">The following represents new activity on the above mentioned matter. </w:t>
-      </w:r>
-    </w:p>
-    <w:p>
-      <w:pPr>
-        <w:rPr>
-          <w:noProof/>
-        </w:rPr>
-      </w:pPr>
-    </w:p>
-    <w:p>
-      <w:pPr>
-        <w:rPr>
-          <w:noProof/>
-        </w:rPr>
-      </w:pPr>
-      <w:r>
-        <w:rPr>
-          <w:noProof/>
-        </w:rPr>
-        <w:t xml:space="preserve">ACTION BEING REPORTED: </w:t>
-      </w:r>
-      <w:r>
-        <w:rPr>
-          <w:noProof/>
-        </w:rPr>
-      </w:r>
-    </w:p>
-    <w:p>
-      <w:pPr>
-        <w:rPr>
-          <w:noProof/>
-        </w:rPr>
-      </w:pPr>
-    </w:p>
-    <w:p>
-      <w:pPr>
-        <w:rPr>
-          <w:noProof/>
-        </w:rPr>
-      </w:pPr>
-      <w:r>
-        <w:rPr>
-          <w:noProof/>
-        </w:rPr>
-        <w:t xml:space="preserve">ACTION REQUIRED: </w:t>
-      </w:r>
-    </w:p>
-    <w:p>
-      <w:pPr>
-        <w:rPr>
-          <w:noProof/>
-        </w:rPr>
-      </w:pPr>
-    </w:p>
-    <w:p>
-      <w:pPr>
-        <w:rPr>
-          <w:noProof/>
-        </w:rPr>
-      </w:pPr>
-      <w:r>
-        <w:rPr>
-          <w:noProof/>
-        </w:rPr>
-        <w:t>ADDITIONAL NOTES:  We have noted that the "Insert Incorrect Information Here" is incorrect and will file the necessary papers to correct this error in due course. . No action is required at this time; we will contact you if we require additional information.</w:t>
-      </w:r>
-    </w:p>
+        <w:t xml:space="preserve">The following represents </w:t>
+      </w:r>
+      <w:r>
+        <w:t>new activity on the above mentioned matter.</w:t>
+      </w:r>
+      <w:r>
+        <w:t xml:space="preserve"> </w:t>
+      </w:r>
+    </w:p>
+    <w:p>
+      <w:pPr>
+        <w:tabs>
+          <w:tab w:val="right" w:pos="9360"/>
+        </w:tabs>
+      </w:pPr>
+    </w:p>
+    <w:p>
+      <w:pPr>
+        <w:tabs>
+          <w:tab w:val="right" w:pos="9360"/>
+        </w:tabs>
+      </w:pPr>
+      <w:r>
+        <w:t>Attached for your file is a copy of the following items filed in the U.S. Patent and Trademark Office with regard to the above identified application:</w:t>
+      </w:r>
+    </w:p>
+    <w:p>
+      <w:pPr>
+        <w:tabs>
+          <w:tab w:val="right" w:pos="9360"/>
+        </w:tabs>
+      </w:pPr>
+    </w:p>
+    <w:p>
+      <w:pPr>
+        <w:tabs>
+          <w:tab w:val="right" w:pos="9360"/>
+        </w:tabs>
+        <w:rPr>
+          <w:u w:val="single"/>
+        </w:rPr>
+      </w:pPr>
+      <w:r>
+        <w:rPr>
+          <w:u w:val="single"/>
+        </w:rPr>
+        <w:t>Date Filed</w:t>
+      </w:r>
+      <w:r>
+        <w:t xml:space="preserve">                             </w:t>
+      </w:r>
+      <w:r>
+        <w:rPr>
+          <w:u w:val="single"/>
+        </w:rPr>
+        <w:t>Document(s)</w:t>
+      </w:r>
+    </w:p>
+    <w:p>
+      <w:pPr>
+        <w:tabs>
+          <w:tab w:val="right" w:pos="9360"/>
+        </w:tabs>
+      </w:pPr>
+      <w:r>
+        <w:t>October 02, 2024</w:t>
+        <w:tab/>
+        <w:tab/>
+        <w:t>Notice of Appeal</w:t>
+        <w:br/>
+        <w:t>July 18, 2024</w:t>
+        <w:tab/>
+        <w:tab/>
+        <w:t xml:space="preserve">Supplemental Information Disclosure Statement            </w:t>
+      </w:r>
+    </w:p>
+    <w:p>
+      <w:pPr>
+        <w:tabs>
+          <w:tab w:val="right" w:pos="9360"/>
+        </w:tabs>
+      </w:pPr>
+    </w:p>
+    <w:p>
+      <w:r>
+        <w:t>ACTION REQUIRED:  None at this time.</w:t>
+      </w:r>
+    </w:p>
+    <w:p>
+      <w:pPr>
+        <w:tabs>
+          <w:tab w:val="right" w:pos="9360"/>
+        </w:tabs>
+      </w:pPr>
+    </w:p>
+    <w:p>
+      <w:r>
+        <w:t xml:space="preserve">ADDITIONAL NOTES:  </w:t>
+      </w:r>
+      <w:r>
+        <w:t xml:space="preserve">If you have any questions or comments, please contact </w:t>
+      </w:r>
+      <w:r>
+        <w:rPr>
+          <w:noProof/>
+        </w:rPr>
+        <w:t>Attorney Test at 612-373-6900 or Emily Bates at 612-371-2163</w:t>
+      </w:r>
+      <w:r>
+        <w:t>.</w:t>
+      </w:r>
+    </w:p>
+    <w:bookmarkEnd w:id="0"/>
+    <w:bookmarkEnd w:id="1"/>
     <w:p/>
     <w:p>
       <w:r>
@@ -334,9 +355,11 @@
       <w:headerReference w:type="default" r:id="rId6"/>
       <w:footerReference w:type="default" r:id="rId9"/>
       <w:pgSz w:w="12240" w:h="15840" w:code="1"/>
-      <w:pgMar w:top="1872" w:right="1440" w:bottom="1440" w:left="1440" w:header="619" w:footer="619" w:gutter="0"/>
+      <w:pgMar w:top="1872" w:right="1440" w:bottom="1440" w:left="1440" w:header="720" w:footer="720" w:gutter="0"/>
+      <w:paperSrc w:first="1" w:other="2"/>
       <w:cols w:space="720"/>
-      <w:noEndnote/>
+      <w:titlePg/>
+      <w:docGrid w:linePitch="360"/>
     </w:sectPr>
   </w:body>
 </w:document>
@@ -392,6 +415,15 @@
 
 <file path=word/header1.xml><?xml version="1.0" encoding="utf-8"?>
 <w:hdr xmlns:wpc="http://schemas.microsoft.com/office/word/2010/wordprocessingCanvas" xmlns:cx="http://schemas.microsoft.com/office/drawing/2014/chartex" xmlns:cx1="http://schemas.microsoft.com/office/drawing/2015/9/8/chartex" xmlns:cx2="http://schemas.microsoft.com/office/drawing/2015/10/21/chartex" xmlns:cx3="http://schemas.microsoft.com/office/drawing/2016/5/9/chartex" xmlns:cx4="http://schemas.microsoft.com/office/drawing/2016/5/10/chartex" xmlns:cx5="http://schemas.microsoft.com/office/drawing/2016/5/11/chartex" xmlns:cx6="http://schemas.microsoft.com/office/drawing/2016/5/12/chartex" xmlns:cx7="http://schemas.microsoft.com/office/drawing/2016/5/13/chartex" xmlns:cx8="http://schemas.microsoft.com/office/drawing/2016/5/14/chartex" xmlns:mc="http://schemas.openxmlformats.org/markup-compatibility/2006" xmlns:aink="http://schemas.microsoft.com/office/drawing/2016/ink" xmlns:am3d="http://schemas.microsoft.com/office/drawing/2017/model3d" xmlns:o="urn:schemas-microsoft-com:office:office" xmlns:oel="http://schemas.microsoft.com/office/2019/extlst" xmlns:r="http://schemas.openxmlformats.org/officeDocument/2006/relationships" xmlns:m="http://schemas.openxmlformats.org/officeDocument/2006/math" xmlns:v="urn:schemas-microsoft-com:vml" xmlns:wp14="http://schemas.microsoft.com/office/word/2010/wordprocessingDrawing" xmlns:wp="http://schemas.openxmlformats.org/drawingml/2006/wordprocessingDrawing" xmlns:w10="urn:schemas-microsoft-com:office:word" xmlns:w="http://schemas.openxmlformats.org/wordprocessingml/2006/main" xmlns:w14="http://schemas.microsoft.com/office/word/2010/wordml" xmlns:w15="http://schemas.microsoft.com/office/word/2012/wordml" xmlns:w16cex="http://schemas.microsoft.com/office/word/2018/wordml/cex" xmlns:w16cid="http://schemas.microsoft.com/office/word/2016/wordml/cid" xmlns:w16="http://schemas.microsoft.com/office/word/2018/wordml" xmlns:w16sdtdh="http://schemas.microsoft.com/office/word/2020/wordml/sdtdatahash" xmlns:w16se="http://schemas.microsoft.com/office/word/2015/wordml/symex" xmlns:wpg="http://schemas.microsoft.com/office/word/2010/wordprocessingGroup" xmlns:wpi="http://schemas.microsoft.com/office/word/2010/wordprocessingInk" xmlns:wne="http://schemas.microsoft.com/office/word/2006/wordml" xmlns:wps="http://schemas.microsoft.com/office/word/2010/wordprocessingShape" mc:Ignorable="w14 w15 w16se w16cid w16 w16cex w16sdtdh wp14">
+  <w:p>
+    <w:pPr>
+      <w:pStyle w:val="Header"/>
+      <w:framePr w:wrap="around" w:vAnchor="text" w:hAnchor="margin" w:y="1"/>
+      <w:rPr>
+        <w:rStyle w:val="PageNumber"/>
+      </w:rPr>
+    </w:pPr>
+  </w:p>
   <w:p>
     <w:pPr>
       <w:pStyle w:val="Header"/>
@@ -696,13 +728,6 @@
   <w:style w:type="paragraph" w:default="1" w:styleId="Normal">
     <w:name w:val="Normal"/>
     <w:qFormat/>
-    <w:rsid w:val="0055512A"/>
-    <w:pPr>
-      <w:widowControl w:val="0"/>
-      <w:autoSpaceDE w:val="0"/>
-      <w:autoSpaceDN w:val="0"/>
-      <w:adjustRightInd w:val="0"/>
-    </w:pPr>
     <w:rPr>
       <w:sz w:val="24"/>
       <w:szCs w:val="24"/>
@@ -735,10 +760,6 @@
     <w:semiHidden/>
     <w:unhideWhenUsed/>
   </w:style>
-  <w:style w:type="character" w:styleId="FootnoteReference">
-    <w:name w:val="footnote reference"/>
-    <w:semiHidden/>
-  </w:style>
   <w:style w:type="paragraph" w:styleId="Header">
     <w:name w:val="header"/>
     <w:basedOn w:val="Normal"/>
@@ -763,58 +784,69 @@
     <w:name w:val="page number"/>
     <w:basedOn w:val="DefaultParagraphFont"/>
   </w:style>
+  <w:style w:type="character" w:styleId="CommentReference">
+    <w:name w:val="annotation reference"/>
+    <w:semiHidden/>
+    <w:rsid w:val="00E37330"/>
+    <w:rPr>
+      <w:sz w:val="16"/>
+      <w:szCs w:val="16"/>
+    </w:rPr>
+  </w:style>
+  <w:style w:type="paragraph" w:styleId="CommentText">
+    <w:name w:val="annotation text"/>
+    <w:basedOn w:val="Normal"/>
+    <w:semiHidden/>
+    <w:rsid w:val="00E37330"/>
+    <w:rPr>
+      <w:sz w:val="20"/>
+      <w:szCs w:val="20"/>
+    </w:rPr>
+  </w:style>
+  <w:style w:type="paragraph" w:styleId="CommentSubject">
+    <w:name w:val="annotation subject"/>
+    <w:basedOn w:val="CommentText"/>
+    <w:next w:val="CommentText"/>
+    <w:semiHidden/>
+    <w:rsid w:val="00E37330"/>
+    <w:rPr>
+      <w:b/>
+      <w:bCs/>
+    </w:rPr>
+  </w:style>
   <w:style w:type="paragraph" w:styleId="BalloonText">
     <w:name w:val="Balloon Text"/>
     <w:basedOn w:val="Normal"/>
     <w:semiHidden/>
-    <w:rsid w:val="00356E2D"/>
+    <w:rsid w:val="00E37330"/>
     <w:rPr>
       <w:rFonts w:ascii="Tahoma" w:hAnsi="Tahoma" w:cs="Tahoma"/>
       <w:sz w:val="16"/>
       <w:szCs w:val="16"/>
     </w:rPr>
   </w:style>
-  <w:style w:type="character" w:styleId="CommentReference">
-    <w:name w:val="annotation reference"/>
-    <w:semiHidden/>
-    <w:rsid w:val="0055512A"/>
-    <w:rPr>
-      <w:sz w:val="16"/>
-      <w:szCs w:val="16"/>
-    </w:rPr>
-  </w:style>
-  <w:style w:type="paragraph" w:styleId="CommentText">
-    <w:name w:val="annotation text"/>
-    <w:basedOn w:val="Normal"/>
-    <w:semiHidden/>
-    <w:rsid w:val="0055512A"/>
-    <w:rPr>
-      <w:sz w:val="20"/>
-      <w:szCs w:val="20"/>
-    </w:rPr>
-  </w:style>
-  <w:style w:type="paragraph" w:styleId="CommentSubject">
-    <w:name w:val="annotation subject"/>
-    <w:basedOn w:val="CommentText"/>
-    <w:next w:val="CommentText"/>
-    <w:semiHidden/>
-    <w:rsid w:val="0055512A"/>
-    <w:rPr>
-      <w:b/>
-      <w:bCs/>
-    </w:rPr>
+  <w:style w:type="table" w:styleId="TableGrid">
+    <w:name w:val="Table Grid"/>
+    <w:basedOn w:val="TableNormal"/>
+    <w:rsid w:val="00B15302"/>
+    <w:tblPr>
+      <w:tblBorders>
+        <w:top w:val="single" w:sz="4" w:space="0" w:color="auto"/>
+        <w:left w:val="single" w:sz="4" w:space="0" w:color="auto"/>
+        <w:bottom w:val="single" w:sz="4" w:space="0" w:color="auto"/>
+        <w:right w:val="single" w:sz="4" w:space="0" w:color="auto"/>
+        <w:insideH w:val="single" w:sz="4" w:space="0" w:color="auto"/>
+        <w:insideV w:val="single" w:sz="4" w:space="0" w:color="auto"/>
+      </w:tblBorders>
+    </w:tblPr>
   </w:style>
   <w:style w:type="paragraph" w:styleId="NormalWeb">
     <w:name w:val="Normal (Web)"/>
     <w:basedOn w:val="Normal"/>
     <w:uiPriority w:val="99"/>
     <w:unhideWhenUsed/>
-    <w:rsid w:val="00EF0A5D"/>
+    <w:rsid w:val="00125027"/>
     <w:pPr>
-      <w:widowControl/>
-      <w:autoSpaceDE/>
-      <w:autoSpaceDN/>
-      <w:adjustRightInd/>
       <w:spacing w:before="100" w:beforeAutospacing="1" w:after="100" w:afterAutospacing="1"/>
     </w:pPr>
     <w:rPr>

</xml_diff>

<commit_message>
Completed 'nonfinalreportFp' and 'ptorecdReport' merge functions.
</commit_message>
<xml_diff>
--- a/project/documents/merged/Document.docx
+++ b/project/documents/merged/Document.docx
@@ -14,13 +14,8 @@
         <w:t>SLW</w:t>
       </w:r>
       <w:r>
-        <w:t xml:space="preserve"> Report Out: Issue Fee </w:t>
-      </w:r>
-      <w:proofErr w:type="gramStart"/>
-      <w:r>
-        <w:t>filed</w:t>
-      </w:r>
-      <w:proofErr w:type="gramEnd"/>
+        <w:t xml:space="preserve"> Report Out: Issue Fee filed</w:t>
+      </w:r>
     </w:p>
     <w:p>
       <w:pPr>
@@ -76,14 +71,8 @@
         <w:spacing w:before="0" w:beforeAutospacing="0" w:after="0" w:afterAutospacing="0"/>
       </w:pPr>
       <w:r>
-        <w:t>Attorney Test 612-373-6900</w:t>
-      </w:r>
-      <w:proofErr w:type="gramStart"/>
-      <w:r>
-        <w:t xml:space="preserve">  mmartin@slwip.com</w:t>
-      </w:r>
-      <w:proofErr w:type="gramEnd"/>
-      <w:r/>
+        <w:t>Attorney Test 612-373-6900  mmartin@slwip.com</w:t>
+      </w:r>
     </w:p>
     <w:p>
       <w:pPr>
@@ -91,69 +80,15 @@
         <w:spacing w:before="0" w:beforeAutospacing="0" w:after="0" w:afterAutospacing="0"/>
       </w:pPr>
       <w:r>
-        <w:t>Emily Bates 612-371-2163</w:t>
-      </w:r>
-      <w:proofErr w:type="gramStart"/>
-      <w:r>
-        <w:t xml:space="preserve">  ebates@slwip.com</w:t>
-      </w:r>
-      <w:proofErr w:type="gramEnd"/>
-      <w:r/>
+        <w:t>Emily Bates 612-371-2163  ebates@slwip.com</w:t>
+      </w:r>
     </w:p>
     <w:p>
       <w:pPr>
         <w:tabs>
-          <w:tab w:val="left" w:pos="720"/>
           <w:tab w:val="right" w:pos="9360"/>
         </w:tabs>
-        <w:ind w:left="480" w:hanging="480"/>
-      </w:pPr>
-    </w:p>
-    <w:p>
-      <w:pPr>
-        <w:tabs>
-          <w:tab w:val="left" w:pos="720"/>
-          <w:tab w:val="right" w:pos="9360"/>
-        </w:tabs>
-        <w:ind w:left="480" w:hanging="480"/>
-        <w:rPr>
-          <w:noProof/>
-        </w:rPr>
-      </w:pPr>
-      <w:r>
-        <w:t>Re:</w:t>
-      </w:r>
-      <w:r>
-        <w:tab/>
-        <w:t xml:space="preserve">ACME Manufacturing </w:t>
-      </w:r>
-      <w:r>
-        <w:rPr>
-          <w:bCs/>
-          <w:noProof/>
-        </w:rPr>
-        <w:t>Ref. No. Pa Da</w:t>
-      </w:r>
-      <w:r>
-        <w:rPr>
-          <w:b/>
-          <w:bCs/>
-          <w:noProof/>
-        </w:rPr>
-        <w:t xml:space="preserve"> -</w:t>
-      </w:r>
-      <w:r>
-        <w:rPr>
-          <w:noProof/>
-        </w:rPr>
-        <w:t xml:space="preserve"> </w:t>
-      </w:r>
-      <w:r>
-        <w:rPr>
-          <w:noProof/>
-        </w:rPr>
-        <w:t>SLW Ref. No. 1.003US1</w:t>
-      </w:r>
+      </w:pPr>
     </w:p>
     <w:p>
       <w:pPr>
@@ -167,13 +102,97 @@
         </w:rPr>
       </w:pPr>
       <w:r>
-        <w:rPr>
+        <w:t>Re:</w:t>
+      </w:r>
+      <w:r>
+        <w:tab/>
+        <w:t xml:space="preserve">ACME Manufacturing </w:t>
+      </w:r>
+      <w:r>
+        <w:rPr>
+          <w:bCs/>
           <w:noProof/>
         </w:rPr>
+        <w:t>Ref. No. Pa Da</w:t>
+      </w:r>
+      <w:r>
+        <w:rPr>
+          <w:b/>
+          <w:bCs/>
+          <w:noProof/>
+        </w:rPr>
+        <w:t xml:space="preserve"> -</w:t>
+      </w:r>
+      <w:r>
+        <w:rPr>
+          <w:noProof/>
+        </w:rPr>
+        <w:t xml:space="preserve"> </w:t>
+      </w:r>
+      <w:r>
+        <w:rPr>
+          <w:noProof/>
+        </w:rPr>
+        <w:t>SLW Ref. No. 1.003US1</w:t>
+      </w:r>
+    </w:p>
+    <w:p>
+      <w:pPr>
+        <w:tabs>
+          <w:tab w:val="left" w:pos="720"/>
+          <w:tab w:val="right" w:pos="9360"/>
+        </w:tabs>
+        <w:ind w:left="720" w:hanging="720"/>
+        <w:rPr>
+          <w:noProof/>
+        </w:rPr>
+      </w:pPr>
+      <w:r>
+        <w:rPr>
+          <w:noProof/>
+        </w:rPr>
         <w:tab/>
       </w:r>
       <w:r>
         <w:t>Patent Application Serial No.: 12/356,986, filed August 21, 2023</w:t>
+      </w:r>
+    </w:p>
+    <w:p>
+      <w:pPr>
+        <w:tabs>
+          <w:tab w:val="left" w:pos="720"/>
+          <w:tab w:val="right" w:pos="9360"/>
+        </w:tabs>
+        <w:ind w:left="720" w:hanging="720"/>
+      </w:pPr>
+      <w:r>
+        <w:rPr>
+          <w:noProof/>
+        </w:rPr>
+        <w:tab/>
+        <w:t>Title:  Method and apparatus for making a title for a matter 1000</w:t>
+      </w:r>
+    </w:p>
+    <w:p>
+      <w:pPr>
+        <w:rPr>
+          <w:noProof/>
+        </w:rPr>
+      </w:pPr>
+      <w:r>
+        <w:rPr>
+          <w:noProof/>
+        </w:rPr>
+      </w:r>
+    </w:p>
+    <w:p>
+      <w:pPr>
+        <w:rPr>
+          <w:noProof/>
+        </w:rPr>
+      </w:pPr>
+      <w:r>
+        <w:t xml:space="preserve">The following represents new activity on the above mentioned matter. </w:t>
       </w:r>
     </w:p>
     <w:p>
@@ -181,234 +200,92 @@
         <w:tabs>
           <w:tab w:val="right" w:pos="9360"/>
         </w:tabs>
-        <w:ind w:left="1350" w:hanging="630"/>
-      </w:pPr>
+      </w:pPr>
+    </w:p>
+    <w:p>
+      <w:pPr>
+        <w:tabs>
+          <w:tab w:val="right" w:pos="9360"/>
+        </w:tabs>
+      </w:pPr>
+      <w:r>
+        <w:t xml:space="preserve">INFORMATION BEING REPORTED:  Documents received from </w:t>
+      </w:r>
+      <w:r>
+        <w:t>the U.S. Patent and Trademark Office</w:t>
+      </w:r>
+    </w:p>
+    <w:p/>
+    <w:p>
+      <w:r>
+        <w:rPr>
+          <w:u w:val="single"/>
+        </w:rPr>
+        <w:t>Date Mailed</w:t>
+      </w:r>
+      <w:r>
+        <w:tab/>
+      </w:r>
+      <w:r>
+        <w:tab/>
+      </w:r>
+      <w:r>
+        <w:rPr>
+          <w:u w:val="single"/>
+        </w:rPr>
+        <w:t>Document(s)</w:t>
+      </w:r>
+    </w:p>
+    <w:p>
+      <w:r>
+        <w:t>October 02, 2024</w:t>
+        <w:tab/>
+        <w:tab/>
+        <w:t>Amendment and Response to Final Office Action</w:t>
+        <w:br/>
+        <w:t>July 18, 2024</w:t>
+        <w:tab/>
+        <w:tab/>
+        <w:t>Supplemental Information Disclosure Statement</w:t>
+        <w:br/>
+        <w:t>July 04, 2024</w:t>
+        <w:tab/>
+        <w:tab/>
+        <w:t>Supplemental Information Disclosure Statement</w:t>
+        <w:br/>
+        <w:t>February 25, 2024</w:t>
+        <w:tab/>
+        <w:tab/>
+        <w:t>Supplemental Information Disclosure Statement</w:t>
+        <w:br/>
+        <w:t>September 03, 2024</w:t>
+        <w:tab/>
+        <w:tab/>
+        <w:t>Supplemental Information Disclosure Statement</w:t>
+      </w:r>
+      <w:r>
+        <w:tab/>
+      </w:r>
+    </w:p>
+    <w:p/>
+    <w:p>
+      <w:r>
+        <w:t xml:space="preserve">ADDITIONAL NOTES:  </w:t>
+      </w:r>
+      <w:r>
+        <w:t xml:space="preserve">If you have any questions or comments, please contact </w:t>
+      </w:r>
       <w:r>
         <w:rPr>
           <w:noProof/>
         </w:rPr>
-        <w:t>Title:  Method and apparatus for making a title for a matter 1000</w:t>
-      </w:r>
-    </w:p>
-    <w:p>
-      <w:pPr>
-        <w:widowControl/>
-        <w:rPr>
-          <w:noProof/>
-        </w:rPr>
-      </w:pPr>
-      <w:r>
-        <w:rPr>
-          <w:noProof/>
-        </w:rPr>
-      </w:r>
-    </w:p>
-    <w:p>
-      <w:pPr>
-        <w:rPr>
-          <w:noProof/>
-        </w:rPr>
-      </w:pPr>
-      <w:r>
-        <w:t xml:space="preserve">The following represents new activity on the </w:t>
-      </w:r>
-      <w:proofErr w:type="gramStart"/>
-      <w:r>
-        <w:t>above mentioned</w:t>
-      </w:r>
-      <w:proofErr w:type="gramEnd"/>
-      <w:r>
-        <w:t xml:space="preserve"> matter. </w:t>
-      </w:r>
-    </w:p>
-    <w:p>
-      <w:pPr>
-        <w:widowControl/>
-        <w:rPr>
-          <w:noProof/>
-        </w:rPr>
-      </w:pPr>
-    </w:p>
-    <w:p>
-      <w:pPr>
-        <w:widowControl/>
-      </w:pPr>
-      <w:r>
-        <w:t>INFORMATION BEING REPORTED:</w:t>
-      </w:r>
-      <w:r>
-        <w:t xml:space="preserve">  Non-Final </w:t>
-      </w:r>
-      <w:r>
-        <w:rPr>
-          <w:noProof/>
-        </w:rPr>
-        <w:t xml:space="preserve">Office Action mailed </w:t>
-      </w:r>
-      <w:r>
-        <w:rPr>
-          <w:noProof/>
-        </w:rPr>
-      </w:r>
-    </w:p>
-    <w:p>
-      <w:pPr>
-        <w:widowControl/>
-      </w:pPr>
-    </w:p>
-    <w:p>
-      <w:pPr>
-        <w:widowControl/>
-        <w:rPr>
-          <w:noProof/>
-        </w:rPr>
-      </w:pPr>
-      <w:r>
-        <w:t>ACTION REQUIRED:</w:t>
-      </w:r>
-      <w:r>
-        <w:t xml:space="preserve">  </w:t>
-      </w:r>
-      <w:r>
-        <w:rPr>
-          <w:noProof/>
-        </w:rPr>
-        <w:t xml:space="preserve">Please provide </w:t>
-      </w:r>
-      <w:r>
-        <w:rPr>
-          <w:noProof/>
-        </w:rPr>
-        <w:t xml:space="preserve">authorization and </w:t>
-      </w:r>
-      <w:r>
-        <w:rPr>
-          <w:noProof/>
-        </w:rPr>
-        <w:t xml:space="preserve">instructions by </w:t>
-      </w:r>
-      <w:r>
-        <w:rPr>
-          <w:b/>
-          <w:noProof/>
-        </w:rPr>
-      </w:r>
-      <w:r>
-        <w:rPr>
-          <w:noProof/>
-        </w:rPr>
-        <w:t xml:space="preserve"> for filing a response to the Office Action.  </w:t>
-      </w:r>
-      <w:r>
-        <w:rPr>
-          <w:noProof/>
-        </w:rPr>
-        <w:t>T</w:t>
-      </w:r>
-      <w:r>
-        <w:rPr>
-          <w:noProof/>
-        </w:rPr>
-        <w:t>he first due date for response is</w:t>
-      </w:r>
-      <w:r>
-        <w:rPr>
-          <w:noProof/>
-        </w:rPr>
-        <w:t xml:space="preserve"> </w:t>
-      </w:r>
-      <w:r>
-        <w:rPr>
-          <w:bCs/>
-          <w:noProof/>
-        </w:rPr>
-      </w:r>
-      <w:r>
-        <w:rPr>
-          <w:bCs/>
-          <w:noProof/>
-        </w:rPr>
-        <w:t>, which can</w:t>
-      </w:r>
-      <w:r>
-        <w:rPr>
-          <w:noProof/>
-        </w:rPr>
-        <w:t xml:space="preserve"> be extended for up to three months upon payment of extension fees.</w:t>
-      </w:r>
-    </w:p>
-    <w:p>
-      <w:pPr>
-        <w:widowControl/>
-        <w:rPr>
-          <w:noProof/>
-        </w:rPr>
-      </w:pPr>
-    </w:p>
-    <w:p>
-      <w:pPr>
-        <w:widowControl/>
-        <w:rPr>
-          <w:noProof/>
-        </w:rPr>
-      </w:pPr>
-      <w:r>
-        <w:rPr>
-          <w:noProof/>
-        </w:rPr>
-        <w:t>ADDITIONAL NOTES:</w:t>
-      </w:r>
-      <w:r>
-        <w:rPr>
-          <w:noProof/>
-        </w:rPr>
-        <w:t xml:space="preserve">  </w:t>
-      </w:r>
-      <w:r>
-        <w:rPr>
-          <w:noProof/>
-        </w:rPr>
-        <w:t xml:space="preserve">We have requested Prioritized Examination in this matter. </w:t>
-      </w:r>
-      <w:r>
-        <w:rPr>
-          <w:noProof/>
-        </w:rPr>
-        <w:t xml:space="preserve">When you have reviewed these materials, please </w:t>
-      </w:r>
-      <w:r>
-        <w:rPr>
-          <w:noProof/>
-        </w:rPr>
-        <w:t>call</w:t>
-      </w:r>
-      <w:r>
-        <w:rPr>
-          <w:noProof/>
-        </w:rPr>
-        <w:t xml:space="preserve"> </w:t>
-      </w:r>
-      <w:r>
-        <w:rPr>
-          <w:noProof/>
-        </w:rPr>
-        <w:t>Attorney Test at 612-373-6900</w:t>
-      </w:r>
-      <w:r>
-        <w:rPr>
-          <w:noProof/>
-        </w:rPr>
-        <w:t xml:space="preserve"> to discuss the appropriate response.</w:t>
-      </w:r>
-    </w:p>
-    <w:p>
-      <w:pPr>
-        <w:widowControl/>
-        <w:tabs>
-          <w:tab w:val="center" w:pos="3384"/>
-        </w:tabs>
-      </w:pPr>
-    </w:p>
+        <w:t>Attorney Test at 612-373-6900 or Emily Bates at 612-371-2163</w:t>
+      </w:r>
+      <w:r>
+        <w:t>.</w:t>
+      </w:r>
+    </w:p>
+    <w:p/>
     <w:p>
       <w:r>
         <w:t xml:space="preserve">Reported By: </w:t>
@@ -466,9 +343,10 @@
       <w:headerReference w:type="default" r:id="rId6"/>
       <w:footerReference w:type="default" r:id="rId9"/>
       <w:pgSz w:w="12240" w:h="15840" w:code="1"/>
-      <w:pgMar w:top="1872" w:right="1440" w:bottom="1440" w:left="1440" w:header="720" w:footer="720" w:gutter="0"/>
+      <w:pgMar w:top="1872" w:right="1440" w:bottom="1440" w:left="1440" w:header="619" w:footer="619" w:gutter="0"/>
       <w:cols w:space="720"/>
-      <w:noEndnote/>
+      <w:titlePg/>
+      <w:docGrid w:linePitch="360"/>
     </w:sectPr>
   </w:body>
 </w:document>
@@ -524,7 +402,20 @@
 
 <file path=word/header1.xml><?xml version="1.0" encoding="utf-8"?>
 <w:hdr xmlns:wpc="http://schemas.microsoft.com/office/word/2010/wordprocessingCanvas" xmlns:cx="http://schemas.microsoft.com/office/drawing/2014/chartex" xmlns:cx1="http://schemas.microsoft.com/office/drawing/2015/9/8/chartex" xmlns:cx2="http://schemas.microsoft.com/office/drawing/2015/10/21/chartex" xmlns:cx3="http://schemas.microsoft.com/office/drawing/2016/5/9/chartex" xmlns:cx4="http://schemas.microsoft.com/office/drawing/2016/5/10/chartex" xmlns:cx5="http://schemas.microsoft.com/office/drawing/2016/5/11/chartex" xmlns:cx6="http://schemas.microsoft.com/office/drawing/2016/5/12/chartex" xmlns:cx7="http://schemas.microsoft.com/office/drawing/2016/5/13/chartex" xmlns:cx8="http://schemas.microsoft.com/office/drawing/2016/5/14/chartex" xmlns:mc="http://schemas.openxmlformats.org/markup-compatibility/2006" xmlns:aink="http://schemas.microsoft.com/office/drawing/2016/ink" xmlns:am3d="http://schemas.microsoft.com/office/drawing/2017/model3d" xmlns:o="urn:schemas-microsoft-com:office:office" xmlns:oel="http://schemas.microsoft.com/office/2019/extlst" xmlns:r="http://schemas.openxmlformats.org/officeDocument/2006/relationships" xmlns:m="http://schemas.openxmlformats.org/officeDocument/2006/math" xmlns:v="urn:schemas-microsoft-com:vml" xmlns:wp14="http://schemas.microsoft.com/office/word/2010/wordprocessingDrawing" xmlns:wp="http://schemas.openxmlformats.org/drawingml/2006/wordprocessingDrawing" xmlns:w10="urn:schemas-microsoft-com:office:word" xmlns:w="http://schemas.openxmlformats.org/wordprocessingml/2006/main" xmlns:w14="http://schemas.microsoft.com/office/word/2010/wordml" xmlns:w15="http://schemas.microsoft.com/office/word/2012/wordml" xmlns:w16cex="http://schemas.microsoft.com/office/word/2018/wordml/cex" xmlns:w16cid="http://schemas.microsoft.com/office/word/2016/wordml/cid" xmlns:w16="http://schemas.microsoft.com/office/word/2018/wordml" xmlns:w16sdtdh="http://schemas.microsoft.com/office/word/2020/wordml/sdtdatahash" xmlns:w16se="http://schemas.microsoft.com/office/word/2015/wordml/symex" xmlns:wpg="http://schemas.microsoft.com/office/word/2010/wordprocessingGroup" xmlns:wpi="http://schemas.microsoft.com/office/word/2010/wordprocessingInk" xmlns:wne="http://schemas.microsoft.com/office/word/2006/wordml" xmlns:wps="http://schemas.microsoft.com/office/word/2010/wordprocessingShape" mc:Ignorable="w14 w15 w16se w16cid w16 w16cex w16sdtdh wp14">
-  <w:p/>
+  <w:p>
+    <w:pPr>
+      <w:pStyle w:val="Header"/>
+      <w:framePr w:wrap="around" w:vAnchor="text" w:hAnchor="margin" w:y="1"/>
+      <w:rPr>
+        <w:rStyle w:val="PageNumber"/>
+      </w:rPr>
+    </w:pPr>
+  </w:p>
+  <w:p>
+    <w:pPr>
+      <w:pStyle w:val="Header"/>
+    </w:pPr>
+  </w:p>
 </w:hdr>
 </file>
 
@@ -542,7 +433,7 @@
   <w:latentStyles w:defLockedState="0" w:defUIPriority="0" w:defSemiHidden="0" w:defUnhideWhenUsed="0" w:defQFormat="0" w:count="376">
     <w:lsdException w:name="Normal" w:qFormat="1"/>
     <w:lsdException w:name="heading 1" w:qFormat="1"/>
-    <w:lsdException w:name="heading 2" w:semiHidden="1" w:unhideWhenUsed="1" w:qFormat="1"/>
+    <w:lsdException w:name="heading 2" w:qFormat="1"/>
     <w:lsdException w:name="heading 3" w:semiHidden="1" w:unhideWhenUsed="1" w:qFormat="1"/>
     <w:lsdException w:name="heading 4" w:semiHidden="1" w:unhideWhenUsed="1" w:qFormat="1"/>
     <w:lsdException w:name="heading 5" w:semiHidden="1" w:unhideWhenUsed="1" w:qFormat="1"/>
@@ -824,7 +715,7 @@
   <w:style w:type="paragraph" w:default="1" w:styleId="Normal">
     <w:name w:val="Normal"/>
     <w:qFormat/>
-    <w:rsid w:val="00ED04DF"/>
+    <w:rsid w:val="00FF25C1"/>
     <w:pPr>
       <w:widowControl w:val="0"/>
       <w:autoSpaceDE w:val="0"/>
@@ -843,15 +734,35 @@
     <w:qFormat/>
     <w:pPr>
       <w:keepNext/>
-      <w:ind w:left="1152" w:hanging="1152"/>
+      <w:widowControl/>
+      <w:autoSpaceDE/>
+      <w:autoSpaceDN/>
+      <w:adjustRightInd/>
       <w:outlineLvl w:val="0"/>
     </w:pPr>
     <w:rPr>
       <w:b/>
-      <w:bCs/>
-      <w:noProof/>
+      <w:sz w:val="20"/>
+      <w:szCs w:val="20"/>
+    </w:rPr>
+  </w:style>
+  <w:style w:type="paragraph" w:styleId="Heading2">
+    <w:name w:val="heading 2"/>
+    <w:basedOn w:val="Normal"/>
+    <w:next w:val="Normal"/>
+    <w:qFormat/>
+    <w:pPr>
+      <w:keepNext/>
+      <w:widowControl/>
+      <w:autoSpaceDE/>
+      <w:autoSpaceDN/>
+      <w:adjustRightInd/>
+      <w:outlineLvl w:val="1"/>
+    </w:pPr>
+    <w:rPr>
+      <w:b/>
       <w:sz w:val="22"/>
-      <w:szCs w:val="22"/>
+      <w:szCs w:val="20"/>
     </w:rPr>
   </w:style>
   <w:style w:type="character" w:default="1" w:styleId="DefaultParagraphFont">
@@ -905,44 +816,11 @@
       </w:tabs>
     </w:pPr>
   </w:style>
-  <w:style w:type="character" w:styleId="PageNumber">
-    <w:name w:val="page number"/>
-    <w:basedOn w:val="DefaultParagraphFont"/>
-  </w:style>
-  <w:style w:type="paragraph" w:styleId="BodyTextIndent">
-    <w:name w:val="Body Text Indent"/>
-    <w:basedOn w:val="Normal"/>
-    <w:pPr>
-      <w:tabs>
-        <w:tab w:val="left" w:pos="-1440"/>
-        <w:tab w:val="left" w:pos="-720"/>
-        <w:tab w:val="left" w:pos="-396"/>
-        <w:tab w:val="left" w:pos="720"/>
-      </w:tabs>
-      <w:ind w:left="720" w:hanging="720"/>
-    </w:pPr>
-    <w:rPr>
-      <w:noProof/>
-      <w:sz w:val="20"/>
-      <w:szCs w:val="20"/>
-    </w:rPr>
-  </w:style>
-  <w:style w:type="paragraph" w:styleId="BodyTextIndent2">
-    <w:name w:val="Body Text Indent 2"/>
-    <w:basedOn w:val="Normal"/>
-    <w:pPr>
-      <w:ind w:left="720" w:hanging="720"/>
-    </w:pPr>
-    <w:rPr>
-      <w:sz w:val="22"/>
-      <w:szCs w:val="22"/>
-    </w:rPr>
-  </w:style>
   <w:style w:type="paragraph" w:styleId="BalloonText">
     <w:name w:val="Balloon Text"/>
     <w:basedOn w:val="Normal"/>
     <w:semiHidden/>
-    <w:rsid w:val="00D150EC"/>
+    <w:rsid w:val="00F16975"/>
     <w:rPr>
       <w:rFonts w:ascii="Tahoma" w:hAnsi="Tahoma" w:cs="Tahoma"/>
       <w:sz w:val="16"/>
@@ -952,7 +830,7 @@
   <w:style w:type="character" w:styleId="CommentReference">
     <w:name w:val="annotation reference"/>
     <w:semiHidden/>
-    <w:rsid w:val="00ED04DF"/>
+    <w:rsid w:val="00FF25C1"/>
     <w:rPr>
       <w:sz w:val="16"/>
       <w:szCs w:val="16"/>
@@ -962,7 +840,7 @@
     <w:name w:val="annotation text"/>
     <w:basedOn w:val="Normal"/>
     <w:semiHidden/>
-    <w:rsid w:val="00ED04DF"/>
+    <w:rsid w:val="00FF25C1"/>
     <w:rPr>
       <w:sz w:val="20"/>
       <w:szCs w:val="20"/>
@@ -973,18 +851,23 @@
     <w:basedOn w:val="CommentText"/>
     <w:next w:val="CommentText"/>
     <w:semiHidden/>
-    <w:rsid w:val="00ED04DF"/>
+    <w:rsid w:val="00FF25C1"/>
     <w:rPr>
       <w:b/>
       <w:bCs/>
     </w:rPr>
+  </w:style>
+  <w:style w:type="character" w:styleId="PageNumber">
+    <w:name w:val="page number"/>
+    <w:basedOn w:val="DefaultParagraphFont"/>
+    <w:rsid w:val="00305F63"/>
   </w:style>
   <w:style w:type="paragraph" w:styleId="NormalWeb">
     <w:name w:val="Normal (Web)"/>
     <w:basedOn w:val="Normal"/>
     <w:uiPriority w:val="99"/>
     <w:unhideWhenUsed/>
-    <w:rsid w:val="00F92502"/>
+    <w:rsid w:val="00800598"/>
     <w:pPr>
       <w:widowControl/>
       <w:autoSpaceDE/>

</xml_diff>

<commit_message>
Worked on multiple merges. Local settings push.
</commit_message>
<xml_diff>
--- a/project/documents/merged/Document.docx
+++ b/project/documents/merged/Document.docx
@@ -56,10 +56,9 @@
     <w:p>
       <w:pPr>
         <w:pStyle w:val="NormalWeb"/>
-        <w:spacing w:before="0" w:beforeAutospacing="0" w:after="0" w:afterAutospacing="0"/>
-      </w:pPr>
-      <w:r>
-        <w:t>&lt;&lt;This.upperFirmName&gt;&gt;</w:t>
+      </w:pPr>
+      <w:r>
+        <w:t>Schwegman Lundberg &amp; Woessner, P.A.</w:t>
       </w:r>
     </w:p>
     <w:p>
@@ -74,14 +73,8 @@
         <w:spacing w:before="0" w:beforeAutospacing="0" w:after="0" w:afterAutospacing="0"/>
       </w:pPr>
       <w:r>
-        <w:t>Attorney Test 612-373-6900</w:t>
-      </w:r>
-      <w:proofErr w:type="gramStart"/>
-      <w:r>
-        <w:t xml:space="preserve">  mmartin@slwip.com</w:t>
-      </w:r>
-      <w:proofErr w:type="gramEnd"/>
-      <w:r/>
+        <w:t>Attorney Test 612-373-6900  mmartin@slwip.com</w:t>
+      </w:r>
     </w:p>
     <w:p>
       <w:pPr>
@@ -89,14 +82,8 @@
         <w:spacing w:before="0" w:beforeAutospacing="0" w:after="0" w:afterAutospacing="0"/>
       </w:pPr>
       <w:r>
-        <w:t>Emily Bates 612-371-2163</w:t>
-      </w:r>
-      <w:proofErr w:type="gramStart"/>
-      <w:r>
-        <w:t xml:space="preserve">  ebates@slwip.com</w:t>
-      </w:r>
-      <w:proofErr w:type="gramEnd"/>
-      <w:r/>
+        <w:t>Emily Bates 612-371-2163  ebates@slwip.com</w:t>
+      </w:r>
     </w:p>
     <w:p>
       <w:pPr>
@@ -168,8 +155,8 @@
         </w:rPr>
         <w:tab/>
       </w:r>
-      <w:smartTag w:uri="urn:schemas-microsoft-com:office:smarttags" w:element="country-region">
-        <w:smartTag w:uri="urn:schemas-microsoft-com:office:smarttags" w:element="place">
+      <w:smartTag w:uri="urn:schemas-microsoft-com:office:smarttags" w:element="place">
+        <w:smartTag w:uri="urn:schemas-microsoft-com:office:smarttags" w:element="country-region">
           <w:r>
             <w:rPr>
               <w:noProof/>
@@ -211,25 +198,16 @@
         <w:rPr>
           <w:noProof/>
         </w:rPr>
-        <w:t>&lt;&lt;salutation&gt;&gt;</w:t>
-      </w:r>
-    </w:p>
-    <w:p>
-      <w:pPr>
-        <w:rPr>
-          <w:noProof/>
-        </w:rPr>
-      </w:pPr>
-      <w:r>
-        <w:t xml:space="preserve">The following represents new activity on the </w:t>
-      </w:r>
-      <w:proofErr w:type="gramStart"/>
-      <w:r>
-        <w:t>above mentioned</w:t>
-      </w:r>
-      <w:proofErr w:type="gramEnd"/>
-      <w:r>
-        <w:t xml:space="preserve"> matter. </w:t>
+      </w:r>
+    </w:p>
+    <w:p>
+      <w:pPr>
+        <w:rPr>
+          <w:noProof/>
+        </w:rPr>
+      </w:pPr>
+      <w:r>
+        <w:t xml:space="preserve">The following represents new activity on the above mentioned matter. </w:t>
       </w:r>
     </w:p>
     <w:p>
@@ -273,13 +251,12 @@
         <w:rPr>
           <w:noProof/>
         </w:rPr>
-        <w:t>&lt;&lt;doa</w:t>
-      </w:r>
-      <w:r>
-        <w:rPr>
-          <w:noProof/>
-        </w:rPr>
-        <w:t>Date&gt;&gt;</w:t>
+        <w:t>No date found</w:t>
+      </w:r>
+      <w:r>
+        <w:rPr>
+          <w:noProof/>
+        </w:rPr>
       </w:r>
     </w:p>
     <w:p>
@@ -311,7 +288,7 @@
         <w:rPr>
           <w:noProof/>
         </w:rPr>
-        <w:t>Affirmed</w:t>
+        <w:t>Reversed</w:t>
       </w:r>
     </w:p>
     <w:p>
@@ -343,172 +320,36 @@
         <w:rPr>
           <w:noProof/>
         </w:rPr>
-        <w:t xml:space="preserve">Please provide </w:t>
-      </w:r>
-      <w:r>
-        <w:rPr>
-          <w:noProof/>
-        </w:rPr>
-        <w:t xml:space="preserve">authorization and </w:t>
-      </w:r>
-      <w:r>
-        <w:rPr>
-          <w:noProof/>
-        </w:rPr>
-        <w:t xml:space="preserve">instructions by </w:t>
-      </w:r>
-      <w:r>
-        <w:rPr>
-          <w:b/>
-          <w:noProof/>
-        </w:rPr>
-        <w:t>&lt;&lt;instDate&gt;&gt;</w:t>
-      </w:r>
-      <w:r>
-        <w:rPr>
-          <w:noProof/>
-        </w:rPr>
-        <w:t xml:space="preserve"> for filing a response to the </w:t>
-      </w:r>
-      <w:r>
-        <w:rPr>
-          <w:noProof/>
-        </w:rPr>
-        <w:t>Decision on Appeal</w:t>
+        <w:t>None at this time</w:t>
+      </w:r>
+    </w:p>
+    <w:p>
+      <w:r/>
+    </w:p>
+    <w:p>
+      <w:r>
+        <w:rPr>
+          <w:noProof/>
+        </w:rPr>
+        <w:t xml:space="preserve">ADDITIONAL NOTES:  </w:t>
+      </w:r>
+      <w:r>
+        <w:rPr>
+          <w:noProof/>
+        </w:rPr>
+        <w:t xml:space="preserve">If you have any questions or comments, please contact </w:t>
+      </w:r>
+      <w:r>
+        <w:rPr>
+          <w:noProof/>
+        </w:rPr>
+        <w:t>Attorney Test at 612-373-6900</w:t>
       </w:r>
       <w:r>
         <w:rPr>
           <w:noProof/>
         </w:rPr>
         <w:t>.</w:t>
-      </w:r>
-      <w:r>
-        <w:rPr>
-          <w:noProof/>
-        </w:rPr>
-        <w:t xml:space="preserve">  The </w:t>
-      </w:r>
-      <w:r>
-        <w:rPr>
-          <w:noProof/>
-        </w:rPr>
-        <w:t xml:space="preserve">final </w:t>
-      </w:r>
-      <w:r>
-        <w:rPr>
-          <w:noProof/>
-        </w:rPr>
-        <w:t xml:space="preserve">due date for response is </w:t>
-      </w:r>
-      <w:r>
-        <w:rPr>
-          <w:b/>
-          <w:noProof/>
-        </w:rPr>
-        <w:t>&lt;&lt;</w:t>
-      </w:r>
-      <w:r>
-        <w:rPr>
-          <w:b/>
-          <w:noProof/>
-        </w:rPr>
-        <w:t>RRRR</w:t>
-      </w:r>
-      <w:r>
-        <w:rPr>
-          <w:b/>
-          <w:noProof/>
-        </w:rPr>
-        <w:t>2</w:t>
-      </w:r>
-      <w:r>
-        <w:rPr>
-          <w:b/>
-          <w:noProof/>
-        </w:rPr>
-        <w:t>Mo&gt;&gt;</w:t>
-      </w:r>
-      <w:r>
-        <w:rPr>
-          <w:b/>
-          <w:noProof/>
-        </w:rPr>
-        <w:t>.</w:t>
-      </w:r>
-      <w:r>
-        <w:rPr>
-          <w:noProof/>
-        </w:rPr>
-        <w:t xml:space="preserve"> This date is NOT extendable. Failure to respond will result in abandonment of the application.</w:t>
-      </w:r>
-    </w:p>
-    <w:p>
-      <w:pPr>
-        <w:rPr>
-          <w:noProof/>
-        </w:rPr>
-      </w:pPr>
-    </w:p>
-    <w:p>
-      <w:r>
-        <w:t>OPTIONS FOR RESPONSE:</w:t>
-      </w:r>
-      <w:r>
-        <w:t xml:space="preserve"> Appeal</w:t>
-      </w:r>
-      <w:r>
-        <w:t xml:space="preserve"> the Decision to the </w:t>
-      </w:r>
-      <w:r>
-        <w:t>Court of Appeals for the Federal Circuit</w:t>
-      </w:r>
-      <w:r>
-        <w:t>; Request a Rehearing; Reopen</w:t>
-      </w:r>
-      <w:r>
-        <w:t xml:space="preserve"> prosecution by filing a Request f</w:t>
-      </w:r>
-      <w:r>
-        <w:t xml:space="preserve">or Continued Examination; </w:t>
-      </w:r>
-      <w:r>
-        <w:t>Allow the application to go abandoned</w:t>
-      </w:r>
-      <w:r>
-        <w:t>.</w:t>
-      </w:r>
-    </w:p>
-    <w:p>
-      <w:pPr>
-        <w:rPr>
-          <w:noProof/>
-        </w:rPr>
-      </w:pPr>
-    </w:p>
-    <w:p>
-      <w:r>
-        <w:rPr>
-          <w:noProof/>
-        </w:rPr>
-        <w:t xml:space="preserve">ADDITIONAL NOTES:  </w:t>
-      </w:r>
-      <w:r>
-        <w:rPr>
-          <w:noProof/>
-        </w:rPr>
-        <w:t xml:space="preserve">When you have reviewed these materials, please call </w:t>
-      </w:r>
-      <w:r>
-        <w:rPr>
-          <w:noProof/>
-        </w:rPr>
-        <w:t>Attorney Test at 612-373-6900</w:t>
-      </w:r>
-      <w:r>
-        <w:rPr>
-          <w:noProof/>
-        </w:rPr>
-        <w:t xml:space="preserve"> to discuss the appropriate response.</w:t>
       </w:r>
     </w:p>
     <w:p/>

</xml_diff>

<commit_message>
Finished and tested function to save and open documents using Azure.
</commit_message>
<xml_diff>
--- a/project/documents/merged/Document.docx
+++ b/project/documents/merged/Document.docx
@@ -265,7 +265,7 @@
           <w:iCs/>
           <w:sz w:val="24"/>
         </w:rPr>
-        <w:t>Claims __, as of November 20, 2024</w:t>
+        <w:t xml:space="preserve">Claims __, as of </w:t>
       </w:r>
       <w:proofErr w:type="spellStart"/>
       <w:r>
@@ -282,7 +282,7 @@
           <w:iCs/>
           <w:sz w:val="24"/>
         </w:rPr>
-        <w:t xml:space="preserve"> (test</w:t>
+        <w:t xml:space="preserve"> (</w:t>
       </w:r>
       <w:proofErr w:type="spellStart"/>
       <w:r>

</xml_diff>

<commit_message>
Added email URL for outlook. Worked on and finished multiple merges.
</commit_message>
<xml_diff>
--- a/project/documents/merged/Document.docx
+++ b/project/documents/merged/Document.docx
@@ -4,235 +4,807 @@
   <w:body>
     <w:p>
       <w:pPr>
+        <w:pStyle w:val="NormalWeb"/>
+        <w:spacing w:before="0" w:beforeAutospacing="0" w:after="0" w:afterAutospacing="0"/>
+      </w:pPr>
+      <w:r>
+        <w:t xml:space="preserve">Subject line: ACME Manufacturing: Ref. No. Pa Da / SLW Ref: 1.003US1 / </w:t>
+      </w:r>
+      <w:r>
+        <w:t>SLW</w:t>
+      </w:r>
+      <w:r>
+        <w:t xml:space="preserve"> Report Out: Revocation and Power of Attorney</w:t>
+      </w:r>
+    </w:p>
+    <w:p>
+      <w:pPr>
+        <w:pStyle w:val="NormalWeb"/>
+        <w:spacing w:before="0" w:beforeAutospacing="0" w:after="0" w:afterAutospacing="0"/>
+      </w:pPr>
+    </w:p>
+    <w:p>
+      <w:pPr>
+        <w:pStyle w:val="NormalWeb"/>
+        <w:spacing w:before="0" w:beforeAutospacing="0" w:after="0" w:afterAutospacing="0"/>
+      </w:pPr>
+    </w:p>
+    <w:p>
+      <w:pPr>
+        <w:pStyle w:val="NormalWeb"/>
+        <w:spacing w:before="0" w:beforeAutospacing="0" w:after="0" w:afterAutospacing="0"/>
+      </w:pPr>
+    </w:p>
+    <w:p>
+      <w:pPr>
+        <w:pStyle w:val="NormalWeb"/>
+        <w:spacing w:before="0" w:beforeAutospacing="0" w:after="0" w:afterAutospacing="0"/>
+      </w:pPr>
+      <w:r>
+        <w:t>Body:</w:t>
+      </w:r>
+    </w:p>
+    <w:p>
+      <w:pPr>
+        <w:pStyle w:val="NormalWeb"/>
+        <w:spacing w:before="0" w:beforeAutospacing="0" w:after="0" w:afterAutospacing="0"/>
+      </w:pPr>
+    </w:p>
+    <w:p>
+      <w:pPr>
+        <w:pStyle w:val="NormalWeb"/>
+        <w:spacing w:before="0" w:beforeAutospacing="0" w:after="0" w:afterAutospacing="0"/>
+      </w:pPr>
+      <w:r>
+        <w:t>Schwegman Lundberg &amp; Woessner, P.A.</w:t>
+      </w:r>
+    </w:p>
+    <w:p>
+      <w:pPr>
+        <w:pStyle w:val="NormalWeb"/>
+        <w:spacing w:before="0" w:beforeAutospacing="0" w:after="0" w:afterAutospacing="0"/>
+      </w:pPr>
+    </w:p>
+    <w:p>
+      <w:pPr>
+        <w:pStyle w:val="NormalWeb"/>
+        <w:spacing w:before="0" w:beforeAutospacing="0" w:after="0" w:afterAutospacing="0"/>
+      </w:pPr>
+      <w:r>
+        <w:t>Attorney Test 612-373-6900</w:t>
+      </w:r>
+      <w:proofErr w:type="gramStart"/>
+      <w:r>
+        <w:t xml:space="preserve">  mmartin@slwip.com</w:t>
+      </w:r>
+      <w:proofErr w:type="gramEnd"/>
+      <w:r/>
+    </w:p>
+    <w:p>
+      <w:pPr>
+        <w:pStyle w:val="NormalWeb"/>
+        <w:spacing w:before="0" w:beforeAutospacing="0" w:after="0" w:afterAutospacing="0"/>
+      </w:pPr>
+      <w:r>
+        <w:t>Emily Bates 612-371-2163</w:t>
+      </w:r>
+      <w:proofErr w:type="gramStart"/>
+      <w:r>
+        <w:t xml:space="preserve">  ebates@slwip.com</w:t>
+      </w:r>
+      <w:proofErr w:type="gramEnd"/>
+      <w:r/>
+    </w:p>
+    <w:p>
+      <w:pPr>
         <w:spacing w:after="0" w:line="240" w:lineRule="auto"/>
-      </w:pPr>
-      <w:r>
-        <w:rPr>
+        <w:rPr>
+          <w:rFonts w:ascii="Times New Roman" w:hAnsi="Times New Roman"/>
+        </w:rPr>
+      </w:pPr>
+    </w:p>
+    <w:p>
+      <w:pPr>
+        <w:spacing w:after="0" w:line="240" w:lineRule="auto"/>
+        <w:rPr>
+          <w:rFonts w:ascii="Times New Roman" w:hAnsi="Times New Roman"/>
+          <w:sz w:val="24"/>
+          <w:szCs w:val="24"/>
+        </w:rPr>
+      </w:pPr>
+      <w:r>
+        <w:rPr>
+          <w:rFonts w:ascii="Times New Roman" w:hAnsi="Times New Roman"/>
+          <w:sz w:val="24"/>
+          <w:szCs w:val="24"/>
+        </w:rPr>
+        <w:t>Re:</w:t>
+      </w:r>
+      <w:r>
+        <w:rPr>
+          <w:rFonts w:ascii="Times New Roman" w:hAnsi="Times New Roman"/>
+          <w:sz w:val="24"/>
+          <w:szCs w:val="24"/>
+        </w:rPr>
+        <w:tab/>
+      </w:r>
+      <w:r>
+        <w:rPr>
+          <w:rFonts w:ascii="Times New Roman" w:hAnsi="Times New Roman"/>
+          <w:sz w:val="24"/>
+        </w:rPr>
+        <w:t xml:space="preserve">ACME Manufacturing </w:t>
+      </w:r>
+      <w:r>
+        <w:rPr>
+          <w:rFonts w:ascii="Times New Roman" w:hAnsi="Times New Roman"/>
+          <w:bCs/>
+          <w:noProof/>
+          <w:sz w:val="24"/>
+        </w:rPr>
+        <w:t>Ref. No. Pa Da</w:t>
+      </w:r>
+      <w:r>
+        <w:rPr>
+          <w:rFonts w:ascii="Times New Roman" w:hAnsi="Times New Roman"/>
           <w:b/>
           <w:bCs/>
-        </w:rPr>
-        <w:t>Subject line:</w:t>
-      </w:r>
-      <w:r>
-        <w:t xml:space="preserve">  ACME Manufacturing: Ref. No. Pa Da / SLW Ref.: 1.003US1 / SLW Report Out: </w:t>
-      </w:r>
-      <w:r>
-        <w:t>Annuity or Patent Expiration Communication</w:t>
+          <w:noProof/>
+          <w:sz w:val="24"/>
+        </w:rPr>
+        <w:t xml:space="preserve"> -</w:t>
+      </w:r>
+      <w:r>
+        <w:rPr>
+          <w:rFonts w:ascii="Times New Roman" w:hAnsi="Times New Roman"/>
+          <w:noProof/>
+          <w:sz w:val="24"/>
+        </w:rPr>
+        <w:t xml:space="preserve"> SLW Ref. No. 1.003US1</w:t>
       </w:r>
     </w:p>
     <w:p>
       <w:pPr>
         <w:spacing w:after="0" w:line="240" w:lineRule="auto"/>
-      </w:pPr>
+        <w:rPr>
+          <w:rFonts w:ascii="Times New Roman" w:hAnsi="Times New Roman"/>
+          <w:sz w:val="24"/>
+          <w:szCs w:val="24"/>
+        </w:rPr>
+      </w:pPr>
+      <w:r>
+        <w:rPr>
+          <w:rFonts w:ascii="Times New Roman" w:hAnsi="Times New Roman"/>
+          <w:sz w:val="24"/>
+          <w:szCs w:val="24"/>
+        </w:rPr>
+        <w:tab/>
+      </w:r>
+      <w:r>
+        <w:rPr>
+          <w:rFonts w:ascii="Times New Roman" w:hAnsi="Times New Roman"/>
+          <w:sz w:val="23"/>
+          <w:szCs w:val="23"/>
+        </w:rPr>
+        <w:t>United States of America</w:t>
+      </w:r>
+      <w:r>
+        <w:rPr>
+          <w:rFonts w:ascii="Times New Roman" w:hAnsi="Times New Roman"/>
+          <w:sz w:val="23"/>
+          <w:szCs w:val="23"/>
+        </w:rPr>
+      </w:r>
+      <w:r>
+        <w:rPr>
+          <w:rFonts w:ascii="Times New Roman" w:hAnsi="Times New Roman"/>
+          <w:sz w:val="23"/>
+          <w:szCs w:val="23"/>
+        </w:rPr>
+      </w:r>
+      <w:r>
+        <w:rPr>
+          <w:rFonts w:ascii="Times New Roman" w:hAnsi="Times New Roman"/>
+          <w:sz w:val="24"/>
+          <w:szCs w:val="24"/>
+        </w:rPr>
+        <w:t xml:space="preserve"> Application No. </w:t>
+      </w:r>
+      <w:r>
+        <w:rPr>
+          <w:rFonts w:ascii="Times New Roman" w:hAnsi="Times New Roman"/>
+          <w:noProof/>
+          <w:sz w:val="24"/>
+        </w:rPr>
+        <w:t>12/356,986</w:t>
+      </w:r>
     </w:p>
     <w:p>
       <w:pPr>
         <w:spacing w:after="0" w:line="240" w:lineRule="auto"/>
-        <w:rPr>
-          <w:b/>
+        <w:ind w:left="720"/>
+        <w:rPr>
+          <w:rFonts w:ascii="Times New Roman" w:hAnsi="Times New Roman"/>
+          <w:sz w:val="24"/>
+          <w:szCs w:val="24"/>
+        </w:rPr>
+      </w:pPr>
+      <w:r>
+        <w:rPr>
+          <w:rFonts w:ascii="Times New Roman" w:hAnsi="Times New Roman"/>
+          <w:sz w:val="24"/>
+          <w:szCs w:val="24"/>
+        </w:rPr>
+        <w:t xml:space="preserve">Title: </w:t>
+      </w:r>
+      <w:r>
+        <w:rPr>
+          <w:rFonts w:ascii="Times New Roman" w:hAnsi="Times New Roman"/>
+          <w:noProof/>
+          <w:sz w:val="24"/>
+        </w:rPr>
+        <w:t>Method and apparatus for making a title for a matter 1000</w:t>
+      </w:r>
+    </w:p>
+    <w:p>
+      <w:pPr>
+        <w:spacing w:after="0"/>
+        <w:rPr>
+          <w:rFonts w:ascii="Times New Roman" w:hAnsi="Times New Roman"/>
+          <w:sz w:val="24"/>
+          <w:szCs w:val="24"/>
+        </w:rPr>
+      </w:pPr>
+      <w:r>
+        <w:rPr>
+          <w:rFonts w:ascii="Times New Roman" w:hAnsi="Times New Roman"/>
+          <w:noProof/>
+          <w:sz w:val="24"/>
+          <w:szCs w:val="24"/>
+        </w:rPr>
+      </w:r>
+    </w:p>
+    <w:p>
+      <w:pPr>
+        <w:spacing w:after="0"/>
+        <w:rPr>
+          <w:rFonts w:ascii="Times New Roman" w:hAnsi="Times New Roman"/>
+          <w:noProof/>
+          <w:sz w:val="24"/>
+          <w:szCs w:val="24"/>
+        </w:rPr>
+      </w:pPr>
+      <w:r>
+        <w:rPr>
+          <w:rFonts w:ascii="Times New Roman" w:hAnsi="Times New Roman"/>
+          <w:sz w:val="24"/>
+          <w:szCs w:val="24"/>
+        </w:rPr>
+        <w:t xml:space="preserve">The following represents new activity on the </w:t>
+      </w:r>
+      <w:proofErr w:type="gramStart"/>
+      <w:r>
+        <w:rPr>
+          <w:rFonts w:ascii="Times New Roman" w:hAnsi="Times New Roman"/>
+          <w:sz w:val="24"/>
+          <w:szCs w:val="24"/>
+        </w:rPr>
+        <w:t>above mentioned</w:t>
+      </w:r>
+      <w:proofErr w:type="gramEnd"/>
+      <w:r>
+        <w:rPr>
+          <w:rFonts w:ascii="Times New Roman" w:hAnsi="Times New Roman"/>
+          <w:sz w:val="24"/>
+          <w:szCs w:val="24"/>
+        </w:rPr>
+        <w:t xml:space="preserve"> matter. </w:t>
+      </w:r>
+    </w:p>
+    <w:p>
+      <w:pPr>
+        <w:spacing w:after="0" w:line="240" w:lineRule="auto"/>
+        <w:rPr>
+          <w:rFonts w:ascii="Times New Roman" w:hAnsi="Times New Roman"/>
+          <w:noProof/>
+          <w:color w:val="000000"/>
+          <w:sz w:val="24"/>
+          <w:szCs w:val="24"/>
+        </w:rPr>
+      </w:pPr>
+    </w:p>
+    <w:p>
+      <w:pPr>
+        <w:spacing w:after="0" w:line="240" w:lineRule="auto"/>
+        <w:ind w:left="1620" w:hanging="1620"/>
+        <w:rPr>
+          <w:rFonts w:ascii="Times New Roman" w:hAnsi="Times New Roman"/>
+          <w:sz w:val="24"/>
+          <w:szCs w:val="24"/>
+        </w:rPr>
+      </w:pPr>
+      <w:r>
+        <w:rPr>
+          <w:rFonts w:ascii="Times New Roman" w:hAnsi="Times New Roman"/>
+          <w:noProof/>
+          <w:color w:val="000000"/>
+          <w:sz w:val="24"/>
+          <w:szCs w:val="24"/>
+        </w:rPr>
+        <w:t xml:space="preserve">ACTION REQUIRED: </w:t>
+      </w:r>
+      <w:r>
+        <w:rPr>
+          <w:rFonts w:ascii="Times New Roman" w:hAnsi="Times New Roman"/>
+          <w:sz w:val="24"/>
+          <w:szCs w:val="24"/>
+        </w:rPr>
+        <w:t xml:space="preserve">Instructions to </w:t>
+      </w:r>
+      <w:r>
+        <w:rPr>
+          <w:rFonts w:ascii="Times New Roman" w:hAnsi="Times New Roman"/>
+          <w:sz w:val="24"/>
+          <w:szCs w:val="24"/>
+        </w:rPr>
+        <w:t>file response to test</w:t>
+      </w:r>
+    </w:p>
+    <w:p>
+      <w:pPr>
+        <w:spacing w:after="0" w:line="240" w:lineRule="auto"/>
+        <w:rPr>
+          <w:rFonts w:ascii="Times New Roman" w:hAnsi="Times New Roman"/>
+          <w:sz w:val="24"/>
+          <w:szCs w:val="24"/>
+        </w:rPr>
+      </w:pPr>
+      <w:r>
+        <w:rPr>
+          <w:rFonts w:ascii="Times New Roman" w:hAnsi="Times New Roman"/>
+          <w:sz w:val="24"/>
+          <w:szCs w:val="24"/>
+        </w:rPr>
+        <w:t>Acceptance Deadline:</w:t>
+      </w:r>
+      <w:r>
+        <w:rPr>
+          <w:rFonts w:ascii="Times New Roman" w:hAnsi="Times New Roman"/>
+          <w:sz w:val="24"/>
+          <w:szCs w:val="24"/>
+        </w:rPr>
+        <w:t xml:space="preserve">  </w:t>
+      </w:r>
+      <w:r>
+        <w:rPr>
+          <w:rFonts w:ascii="Times New Roman" w:hAnsi="Times New Roman"/>
+          <w:sz w:val="24"/>
+          <w:szCs w:val="24"/>
+        </w:rPr>
+        <w:t>2024-12-10</w:t>
+      </w:r>
+      <w:r>
+        <w:rPr>
+          <w:rFonts w:ascii="Times New Roman" w:hAnsi="Times New Roman"/>
+          <w:sz w:val="24"/>
+          <w:szCs w:val="24"/>
+        </w:rPr>
+      </w:r>
+      <w:r>
+        <w:rPr>
+          <w:rFonts w:ascii="Times New Roman" w:hAnsi="Times New Roman"/>
+          <w:sz w:val="24"/>
+          <w:szCs w:val="24"/>
+        </w:rPr>
+      </w:r>
+      <w:r>
+        <w:rPr>
+          <w:rFonts w:ascii="Times New Roman" w:hAnsi="Times New Roman"/>
+          <w:sz w:val="24"/>
+          <w:szCs w:val="24"/>
+        </w:rPr>
+      </w:r>
+    </w:p>
+    <w:p>
+      <w:pPr>
+        <w:spacing w:after="0" w:line="240" w:lineRule="auto"/>
+        <w:rPr>
+          <w:rFonts w:ascii="Times New Roman" w:hAnsi="Times New Roman"/>
+          <w:sz w:val="24"/>
+          <w:szCs w:val="24"/>
+        </w:rPr>
+      </w:pPr>
+      <w:r>
+        <w:rPr>
+          <w:rFonts w:ascii="Times New Roman" w:hAnsi="Times New Roman"/>
+          <w:sz w:val="24"/>
+          <w:szCs w:val="24"/>
+        </w:rPr>
+        <w:t>Requested Instructions by:  2024-12-17</w:t>
+      </w:r>
+      <w:r>
+        <w:rPr>
+          <w:rFonts w:ascii="Times New Roman" w:hAnsi="Times New Roman"/>
+          <w:sz w:val="24"/>
+          <w:szCs w:val="24"/>
+        </w:rPr>
+      </w:r>
+      <w:r>
+        <w:rPr>
+          <w:rFonts w:ascii="Times New Roman" w:hAnsi="Times New Roman"/>
+          <w:sz w:val="24"/>
+          <w:szCs w:val="24"/>
+        </w:rPr>
+      </w:r>
+    </w:p>
+    <w:p>
+      <w:pPr>
+        <w:spacing w:after="0" w:line="240" w:lineRule="auto"/>
+        <w:rPr>
+          <w:rFonts w:ascii="Times New Roman" w:hAnsi="Times New Roman"/>
+          <w:sz w:val="24"/>
+          <w:szCs w:val="24"/>
+        </w:rPr>
+      </w:pPr>
+    </w:p>
+    <w:p>
+      <w:pPr>
+        <w:spacing w:after="0" w:line="240" w:lineRule="auto"/>
+        <w:rPr>
+          <w:rFonts w:ascii="Times New Roman" w:hAnsi="Times New Roman"/>
+          <w:sz w:val="24"/>
+          <w:szCs w:val="24"/>
+        </w:rPr>
+      </w:pPr>
+      <w:r>
+        <w:rPr>
+          <w:rFonts w:ascii="Times New Roman" w:hAnsi="Times New Roman"/>
+          <w:sz w:val="24"/>
+          <w:szCs w:val="24"/>
+        </w:rPr>
+        <w:t>INFORMATION BEING REPORTED:</w:t>
+      </w:r>
+      <w:r>
+        <w:t xml:space="preserve">  </w:t>
+      </w:r>
+      <w:r>
+        <w:rPr>
+          <w:rFonts w:ascii="Times New Roman" w:hAnsi="Times New Roman"/>
+          <w:sz w:val="24"/>
+          <w:szCs w:val="24"/>
+        </w:rPr>
+        <w:t>Attached</w:t>
+      </w:r>
+      <w:r>
+        <w:rPr>
+          <w:rFonts w:ascii="Times New Roman" w:hAnsi="Times New Roman"/>
+          <w:sz w:val="24"/>
+          <w:szCs w:val="24"/>
+        </w:rPr>
+        <w:t xml:space="preserve"> please find a copy of the associate’s letter, together with a c</w:t>
+      </w:r>
+      <w:r>
+        <w:rPr>
+          <w:rFonts w:ascii="Times New Roman" w:hAnsi="Times New Roman"/>
+          <w:sz w:val="24"/>
+          <w:szCs w:val="24"/>
+        </w:rPr>
+        <w:t xml:space="preserve">opy of </w:t>
+      </w:r>
+      <w:r>
+        <w:rPr>
+          <w:rFonts w:ascii="Times New Roman" w:hAnsi="Times New Roman"/>
+          <w:sz w:val="24"/>
+          <w:szCs w:val="24"/>
+        </w:rPr>
+        <w:t>the</w:t>
+      </w:r>
+      <w:r>
+        <w:rPr>
+          <w:rFonts w:ascii="Times New Roman" w:hAnsi="Times New Roman"/>
+          <w:sz w:val="24"/>
+          <w:szCs w:val="24"/>
+        </w:rPr>
+        <w:t xml:space="preserve"> </w:t>
+      </w:r>
+      <w:r>
+        <w:rPr>
+          <w:rFonts w:ascii="Times New Roman" w:hAnsi="Times New Roman"/>
+          <w:sz w:val="24"/>
+          <w:szCs w:val="24"/>
+        </w:rPr>
+        <w:t>test</w:t>
+      </w:r>
+      <w:r>
+        <w:rPr>
+          <w:rFonts w:ascii="Times New Roman" w:hAnsi="Times New Roman"/>
+          <w:sz w:val="24"/>
+          <w:szCs w:val="24"/>
+        </w:rPr>
+        <w:t xml:space="preserve"> </w:t>
+      </w:r>
+      <w:r>
+        <w:rPr>
+          <w:rFonts w:ascii="Times New Roman" w:hAnsi="Times New Roman"/>
+          <w:sz w:val="24"/>
+          <w:szCs w:val="24"/>
+        </w:rPr>
+        <w:t>&lt;&lt;</w:t>
+      </w:r>
+      <w:r>
+        <w:rPr>
+          <w:rFonts w:ascii="Times New Roman" w:hAnsi="Times New Roman"/>
+          <w:sz w:val="24"/>
+          <w:szCs w:val="24"/>
+        </w:rPr>
+        <w:t>citedRef&gt;&gt;</w:t>
+      </w:r>
+      <w:r>
+        <w:rPr>
+          <w:rFonts w:ascii="Times New Roman" w:hAnsi="Times New Roman"/>
+          <w:sz w:val="24"/>
+          <w:szCs w:val="24"/>
+        </w:rPr>
+        <w:t xml:space="preserve">relative to the above-identified application.  The application must be placed in order for acceptance by </w:t>
+      </w:r>
+      <w:r>
+        <w:rPr>
+          <w:rFonts w:ascii="Times New Roman" w:hAnsi="Times New Roman"/>
+          <w:sz w:val="24"/>
+          <w:szCs w:val="24"/>
+        </w:rPr>
+        <w:t>2024-12-10</w:t>
+      </w:r>
+      <w:r>
+        <w:rPr>
+          <w:rFonts w:ascii="Times New Roman" w:hAnsi="Times New Roman"/>
+          <w:sz w:val="24"/>
+          <w:szCs w:val="24"/>
+        </w:rPr>
+      </w:r>
+      <w:r>
+        <w:rPr>
+          <w:rFonts w:ascii="Times New Roman" w:hAnsi="Times New Roman"/>
+          <w:sz w:val="24"/>
+          <w:szCs w:val="24"/>
+        </w:rPr>
+      </w:r>
+      <w:r>
+        <w:rPr>
+          <w:rFonts w:ascii="Times New Roman" w:hAnsi="Times New Roman"/>
+          <w:sz w:val="24"/>
+          <w:szCs w:val="24"/>
+        </w:rPr>
+        <w:t>.  However, since we are able to</w:t>
+      </w:r>
+      <w:r>
+        <w:rPr>
+          <w:rFonts w:ascii="Times New Roman" w:hAnsi="Times New Roman"/>
+          <w:sz w:val="24"/>
+          <w:szCs w:val="24"/>
+        </w:rPr>
+        <w:t xml:space="preserve"> correspond with the Examiner as ma</w:t>
+      </w:r>
+      <w:r>
+        <w:rPr>
+          <w:rFonts w:ascii="Times New Roman" w:hAnsi="Times New Roman"/>
+          <w:sz w:val="24"/>
+          <w:szCs w:val="24"/>
+        </w:rPr>
+        <w:t>ny times as possible before the</w:t>
+      </w:r>
+      <w:r>
+        <w:rPr>
+          <w:rFonts w:ascii="Times New Roman" w:hAnsi="Times New Roman"/>
+          <w:sz w:val="24"/>
+          <w:szCs w:val="24"/>
+        </w:rPr>
+        <w:t xml:space="preserve"> deadline, amendment instructions should be provided to the associate well in advance of this deadline</w:t>
+      </w:r>
+      <w:r>
+        <w:rPr>
+          <w:rFonts w:ascii="Times New Roman" w:hAnsi="Times New Roman"/>
+          <w:sz w:val="24"/>
+          <w:szCs w:val="24"/>
+        </w:rPr>
+        <w:t xml:space="preserve">.  </w:t>
+      </w:r>
+    </w:p>
+    <w:p>
+      <w:pPr>
+        <w:spacing w:after="0" w:line="240" w:lineRule="auto"/>
+        <w:rPr>
+          <w:rFonts w:ascii="Times New Roman" w:hAnsi="Times New Roman"/>
+          <w:sz w:val="24"/>
+          <w:szCs w:val="24"/>
+        </w:rPr>
+      </w:pPr>
+    </w:p>
+    <w:p>
+      <w:pPr>
+        <w:spacing w:after="0" w:line="240" w:lineRule="auto"/>
+        <w:rPr>
+          <w:rFonts w:ascii="Times New Roman" w:hAnsi="Times New Roman"/>
+          <w:sz w:val="24"/>
+          <w:szCs w:val="24"/>
+        </w:rPr>
+      </w:pPr>
+      <w:r>
+        <w:rPr>
+          <w:rFonts w:ascii="Times New Roman" w:hAnsi="Times New Roman"/>
+          <w:sz w:val="24"/>
+          <w:szCs w:val="24"/>
+        </w:rPr>
+        <w:t>To ensure the best chances of acceptance by the deadline, we request your instructions by</w:t>
+      </w:r>
+      <w:r>
+        <w:rPr>
+          <w:rFonts w:ascii="Times New Roman" w:hAnsi="Times New Roman"/>
+          <w:sz w:val="24"/>
+          <w:szCs w:val="24"/>
+        </w:rPr>
+        <w:t xml:space="preserve"> </w:t>
+      </w:r>
+      <w:r>
+        <w:rPr>
+          <w:rFonts w:ascii="Times New Roman" w:hAnsi="Times New Roman"/>
+          <w:sz w:val="24"/>
+          <w:szCs w:val="24"/>
+        </w:rPr>
+        <w:t>2024-12-17</w:t>
+      </w:r>
+      <w:r>
+        <w:rPr>
+          <w:rFonts w:ascii="Times New Roman" w:hAnsi="Times New Roman"/>
+          <w:sz w:val="24"/>
+          <w:szCs w:val="24"/>
+        </w:rPr>
+      </w:r>
+      <w:r>
+        <w:rPr>
+          <w:rFonts w:ascii="Times New Roman" w:hAnsi="Times New Roman"/>
+          <w:sz w:val="24"/>
+          <w:szCs w:val="24"/>
+        </w:rPr>
+      </w:r>
+      <w:r>
+        <w:rPr>
+          <w:rFonts w:ascii="Times New Roman" w:hAnsi="Times New Roman"/>
+          <w:sz w:val="24"/>
+          <w:szCs w:val="24"/>
+        </w:rPr>
+        <w:t xml:space="preserve"> and, failing those,</w:t>
+      </w:r>
+      <w:r>
+        <w:rPr>
+          <w:rFonts w:ascii="Times New Roman" w:hAnsi="Times New Roman"/>
+          <w:sz w:val="24"/>
+          <w:szCs w:val="24"/>
+        </w:rPr>
+        <w:t xml:space="preserve"> we will </w:t>
+      </w:r>
+      <w:r>
+        <w:rPr>
+          <w:rFonts w:ascii="Times New Roman" w:hAnsi="Times New Roman"/>
+          <w:sz w:val="24"/>
+          <w:szCs w:val="24"/>
+        </w:rPr>
+        <w:t>send regular reminders to you</w:t>
+      </w:r>
+      <w:r>
+        <w:rPr>
+          <w:rFonts w:ascii="Times New Roman" w:hAnsi="Times New Roman"/>
+          <w:sz w:val="24"/>
+          <w:szCs w:val="24"/>
+        </w:rPr>
+        <w:t>.</w:t>
+      </w:r>
+    </w:p>
+    <w:p>
+      <w:pPr>
+        <w:spacing w:after="0" w:line="240" w:lineRule="auto"/>
+        <w:rPr>
+          <w:rFonts w:ascii="Times New Roman" w:hAnsi="Times New Roman"/>
+          <w:sz w:val="24"/>
+          <w:szCs w:val="24"/>
+        </w:rPr>
+      </w:pPr>
+    </w:p>
+    <w:p>
+      <w:pPr>
+        <w:spacing w:after="0" w:line="240" w:lineRule="auto"/>
+        <w:rPr>
+          <w:rFonts w:ascii="Times New Roman" w:hAnsi="Times New Roman"/>
+          <w:sz w:val="24"/>
+          <w:szCs w:val="24"/>
+        </w:rPr>
+      </w:pPr>
+      <w:r>
+        <w:rPr>
+          <w:rFonts w:ascii="Times New Roman" w:hAnsi="Times New Roman"/>
+          <w:noProof/>
+          <w:color w:val="000000"/>
+          <w:sz w:val="24"/>
+          <w:szCs w:val="24"/>
+        </w:rPr>
+        <w:t xml:space="preserve">ADDITIONAL NOTES:  </w:t>
+      </w:r>
+      <w:r>
+        <w:rPr>
+          <w:rFonts w:ascii="Times New Roman" w:hAnsi="Times New Roman"/>
+          <w:noProof/>
+          <w:color w:val="000000"/>
+          <w:sz w:val="24"/>
+          <w:szCs w:val="24"/>
+        </w:rPr>
+        <w:t xml:space="preserve">Please refer to the associate’s letter for more details regarding this matter. </w:t>
+      </w:r>
+      <w:r>
+        <w:rPr>
+          <w:rFonts w:ascii="Times New Roman" w:hAnsi="Times New Roman"/>
+          <w:noProof/>
+          <w:color w:val="000000"/>
+          <w:sz w:val="24"/>
+          <w:szCs w:val="24"/>
+        </w:rPr>
+        <w:t xml:space="preserve"> </w:t>
+      </w:r>
+      <w:r>
+        <w:rPr>
+          <w:rFonts w:ascii="Times New Roman" w:hAnsi="Times New Roman"/>
+          <w:sz w:val="24"/>
+          <w:szCs w:val="24"/>
+        </w:rPr>
+        <w:t xml:space="preserve">If you have any questions or comments, please contact </w:t>
+      </w:r>
+      <w:r>
+        <w:rPr>
+          <w:rFonts w:ascii="Times New Roman" w:hAnsi="Times New Roman"/>
           <w:bCs/>
-        </w:rPr>
-      </w:pPr>
-      <w:r>
-        <w:rPr>
-          <w:b/>
+          <w:sz w:val="24"/>
+          <w:szCs w:val="24"/>
+        </w:rPr>
+        <w:t>Attorney Test at 612-373-6900</w:t>
+      </w:r>
+      <w:r>
+        <w:rPr>
+          <w:rFonts w:ascii="Times New Roman" w:hAnsi="Times New Roman"/>
           <w:bCs/>
-        </w:rPr>
-        <w:t>Body of email:</w:t>
-      </w:r>
-    </w:p>
-    <w:p>
-      <w:pPr>
+          <w:sz w:val="24"/>
+          <w:szCs w:val="24"/>
+        </w:rPr>
+        <w:t xml:space="preserve"> or Emily Bates at 612-371-2163</w:t>
+      </w:r>
+      <w:r>
+        <w:rPr>
+          <w:rFonts w:ascii="Times New Roman" w:hAnsi="Times New Roman"/>
+          <w:bCs/>
+          <w:sz w:val="24"/>
+          <w:szCs w:val="24"/>
+        </w:rPr>
+      </w:r>
+      <w:r>
+        <w:rPr>
+          <w:rFonts w:ascii="Times New Roman" w:hAnsi="Times New Roman"/>
+          <w:sz w:val="24"/>
+          <w:szCs w:val="24"/>
+        </w:rPr>
+        <w:t>.</w:t>
+      </w:r>
+    </w:p>
+    <w:p>
+      <w:pPr>
+        <w:tabs>
+          <w:tab w:val="right" w:pos="9360"/>
+        </w:tabs>
         <w:spacing w:after="0" w:line="240" w:lineRule="auto"/>
-      </w:pPr>
-    </w:p>
-    <w:p>
-      <w:pPr>
-        <w:spacing w:after="0" w:line="240" w:lineRule="auto"/>
-      </w:pPr>
-      <w:r>
-        <w:t xml:space="preserve">SCHWEGMAN, LUNDBERG &amp; WOESSNER, P.A. </w:t>
-      </w:r>
-    </w:p>
-    <w:p>
-      <w:pPr>
-        <w:spacing w:after="0" w:line="240" w:lineRule="auto"/>
-      </w:pPr>
-    </w:p>
-    <w:p>
-      <w:pPr>
-        <w:spacing w:after="0" w:line="240" w:lineRule="auto"/>
-      </w:pPr>
-      <w:r>
-        <w:t>Attorney Test 612-373-6900</w:t>
-      </w:r>
-    </w:p>
-    <w:p>
-      <w:pPr>
-        <w:spacing w:after="0" w:line="240" w:lineRule="auto"/>
-      </w:pPr>
-      <w:r>
-        <w:t>mmartin@slwip.com</w:t>
-      </w:r>
-    </w:p>
-    <w:p>
-      <w:pPr>
-        <w:spacing w:after="0" w:line="240" w:lineRule="auto"/>
-      </w:pPr>
-    </w:p>
-    <w:p>
-      <w:pPr>
-        <w:spacing w:after="0" w:line="240" w:lineRule="auto"/>
-      </w:pPr>
-      <w:r>
-        <w:t>Emily Bates 612-371-2163</w:t>
-      </w:r>
-    </w:p>
-    <w:p>
-      <w:pPr>
-        <w:spacing w:after="0" w:line="240" w:lineRule="auto"/>
-      </w:pPr>
-      <w:r>
-        <w:t>ebates@slwip.com</w:t>
-      </w:r>
-    </w:p>
-    <w:p>
-      <w:pPr>
-        <w:spacing w:after="0" w:line="240" w:lineRule="auto"/>
-      </w:pPr>
-    </w:p>
-    <w:p>
-      <w:pPr>
-        <w:spacing w:after="0" w:line="240" w:lineRule="auto"/>
-      </w:pPr>
-      <w:r>
-        <w:t>Re:   ACME Manufacturing Ref. No. Pa Da - SLW Ref. No. 1.003US1</w:t>
-      </w:r>
-    </w:p>
-    <w:p>
-      <w:pPr>
-        <w:spacing w:after="0" w:line="240" w:lineRule="auto"/>
-      </w:pPr>
-      <w:r>
-        <w:tab/>
-        <w:t>United States of America Application No. 12/356,986</w:t>
-      </w:r>
-    </w:p>
-    <w:p>
-      <w:pPr>
-        <w:spacing w:after="0" w:line="240" w:lineRule="auto"/>
-      </w:pPr>
-      <w:r>
-        <w:tab/>
-        <w:t>Title: Method and apparatus for making a title for a matter 1000</w:t>
-      </w:r>
-    </w:p>
-    <w:p>
-      <w:pPr>
-        <w:spacing w:after="0" w:line="240" w:lineRule="auto"/>
-      </w:pPr>
-    </w:p>
-    <w:p>
-      <w:pPr>
-        <w:spacing w:after="0" w:line="240" w:lineRule="auto"/>
-      </w:pPr>
-      <w:r>
-        <w:t xml:space="preserve">The following represents new activity on the above mentioned matter. </w:t>
-      </w:r>
-    </w:p>
-    <w:p>
-      <w:pPr>
-        <w:spacing w:after="0" w:line="240" w:lineRule="auto"/>
-      </w:pPr>
-    </w:p>
-    <w:p>
-      <w:pPr>
-        <w:spacing w:after="0" w:line="240" w:lineRule="auto"/>
-      </w:pPr>
-      <w:r>
-        <w:t>INFORMATION BEING REPORTED:  Attached for your file is a copy of the associate's letter and the following item received from the patent office with regard to the above-identified application:</w:t>
-      </w:r>
-    </w:p>
-    <w:p>
-      <w:pPr>
-        <w:spacing w:after="0" w:line="240" w:lineRule="auto"/>
-      </w:pPr>
-    </w:p>
-    <w:p>
-      <w:pPr>
-        <w:spacing w:after="0" w:line="240" w:lineRule="auto"/>
-      </w:pPr>
-      <w:r>
-        <w:t>Document</w:t>
-      </w:r>
-    </w:p>
-    <w:p>
-      <w:pPr>
-        <w:spacing w:after="0" w:line="240" w:lineRule="auto"/>
-      </w:pPr>
-      <w:r>
-        <w:t>Annuity or Patent Expiration Communication (Not Responsible for Docketing)</w:t>
-      </w:r>
-    </w:p>
-    <w:p>
-      <w:pPr>
-        <w:spacing w:after="0" w:line="240" w:lineRule="auto"/>
-      </w:pPr>
-    </w:p>
-    <w:p>
-      <w:pPr>
-        <w:spacing w:after="0" w:line="240" w:lineRule="auto"/>
-      </w:pPr>
-      <w:r>
-        <w:t>ADDITIONAL NOTES: Please refer to the associate's letter for more details regarding this matter.  We forward this to you as a courtesy, as SLW does not handle annuities for ACME Manufacturing. Please consult with your annuity payment service regarding any questions or concerns you might have regarding this matter.</w:t>
-      </w:r>
-    </w:p>
-    <w:p>
-      <w:pPr>
-        <w:pStyle w:val="NormalWeb"/>
-      </w:pPr>
-      <w:r>
-        <w:t>If you have any questions pertaining to revival of an abandoned/expired patent or annuity, please contact Attorney Test at 612-373-6900 or Emily Bates at 612-371-2163 to discuss further options.</w:t>
-      </w:r>
-    </w:p>
-    <w:p>
-      <w:pPr>
-        <w:pStyle w:val="NormalWeb"/>
-      </w:pPr>
-      <w:r>
-        <w:t xml:space="preserve">Reported By: </w:t>
-      </w:r>
-    </w:p>
-    <w:p>
-      <w:pPr>
-        <w:spacing w:after="0" w:line="240" w:lineRule="auto"/>
-      </w:pPr>
-      <w:r>
-        <w:t>Caitlin E. Puckett</w:t>
-      </w:r>
-    </w:p>
-    <w:p>
-      <w:pPr>
-        <w:spacing w:after="0" w:line="240" w:lineRule="auto"/>
-      </w:pPr>
-      <w:r>
-        <w:t>Case Management Assistant, International Department</w:t>
-      </w:r>
-    </w:p>
-    <w:p>
-      <w:pPr>
-        <w:spacing w:after="0" w:line="240" w:lineRule="auto"/>
-      </w:pPr>
-    </w:p>
-    <w:p>
-      <w:pPr>
-        <w:spacing w:after="0" w:line="240" w:lineRule="auto"/>
-      </w:pPr>
-      <w:r>
-        <w:t>Attachment</w:t>
-      </w:r>
-    </w:p>
-    <w:p/>
+        <w:rPr>
+          <w:rFonts w:ascii="Times New Roman" w:hAnsi="Times New Roman"/>
+          <w:sz w:val="24"/>
+          <w:szCs w:val="24"/>
+        </w:rPr>
+      </w:pPr>
+    </w:p>
     <w:p>
       <w:r>
         <w:t xml:space="preserve">Reported By: </w:t>
@@ -323,17 +895,11 @@
   <w:docDefaults>
     <w:rPrDefault>
       <w:rPr>
-        <w:rFonts w:asciiTheme="minorHAnsi" w:eastAsiaTheme="minorHAnsi" w:hAnsiTheme="minorHAnsi" w:cstheme="minorBidi"/>
-        <w:sz w:val="22"/>
-        <w:szCs w:val="22"/>
+        <w:rFonts w:ascii="Calibri" w:eastAsia="Calibri" w:hAnsi="Calibri" w:cs="Times New Roman"/>
         <w:lang w:val="en-US" w:eastAsia="en-US" w:bidi="ar-SA"/>
       </w:rPr>
     </w:rPrDefault>
-    <w:pPrDefault>
-      <w:pPr>
-        <w:spacing w:after="160" w:line="259" w:lineRule="auto"/>
-      </w:pPr>
-    </w:pPrDefault>
+    <w:pPrDefault/>
   </w:docDefaults>
   <w:latentStyles w:defLockedState="0" w:defUIPriority="99" w:defSemiHidden="0" w:defUnhideWhenUsed="0" w:defQFormat="0" w:count="376">
     <w:lsdException w:name="Normal" w:uiPriority="0" w:qFormat="1"/>
@@ -423,7 +989,7 @@
     <w:lsdException w:name="Block Text" w:semiHidden="1" w:unhideWhenUsed="1"/>
     <w:lsdException w:name="Hyperlink" w:semiHidden="1" w:unhideWhenUsed="1"/>
     <w:lsdException w:name="FollowedHyperlink" w:semiHidden="1" w:unhideWhenUsed="1"/>
-    <w:lsdException w:name="Strong" w:uiPriority="22" w:qFormat="1"/>
+    <w:lsdException w:name="Strong" w:uiPriority="0" w:qFormat="1"/>
     <w:lsdException w:name="Emphasis" w:uiPriority="20" w:qFormat="1"/>
     <w:lsdException w:name="Document Map" w:semiHidden="1" w:unhideWhenUsed="1"/>
     <w:lsdException w:name="Plain Text" w:semiHidden="1" w:unhideWhenUsed="1"/>
@@ -490,7 +1056,7 @@
     <w:lsdException w:name="Table Web 2" w:semiHidden="1" w:unhideWhenUsed="1"/>
     <w:lsdException w:name="Table Web 3" w:semiHidden="1" w:unhideWhenUsed="1"/>
     <w:lsdException w:name="Balloon Text" w:semiHidden="1" w:unhideWhenUsed="1"/>
-    <w:lsdException w:name="Table Grid" w:uiPriority="39"/>
+    <w:lsdException w:name="Table Grid" w:uiPriority="59"/>
     <w:lsdException w:name="Table Theme" w:semiHidden="1" w:unhideWhenUsed="1"/>
     <w:lsdException w:name="Placeholder Text" w:semiHidden="1"/>
     <w:lsdException w:name="No Spacing" w:uiPriority="1" w:qFormat="1"/>
@@ -716,7 +1282,14 @@
   <w:style w:type="paragraph" w:default="1" w:styleId="Normal">
     <w:name w:val="Normal"/>
     <w:qFormat/>
-    <w:rsid w:val="00515497"/>
+    <w:rsid w:val="00B01FE4"/>
+    <w:pPr>
+      <w:spacing w:after="200" w:line="276" w:lineRule="auto"/>
+    </w:pPr>
+    <w:rPr>
+      <w:sz w:val="22"/>
+      <w:szCs w:val="22"/>
+    </w:rPr>
   </w:style>
   <w:style w:type="character" w:default="1" w:styleId="DefaultParagraphFont">
     <w:name w:val="Default Paragraph Font"/>
@@ -745,18 +1318,120 @@
     <w:semiHidden/>
     <w:unhideWhenUsed/>
   </w:style>
+  <w:style w:type="character" w:styleId="Hyperlink">
+    <w:name w:val="Hyperlink"/>
+    <w:uiPriority w:val="99"/>
+    <w:unhideWhenUsed/>
+    <w:rsid w:val="00B7670C"/>
+    <w:rPr>
+      <w:color w:val="0000FF"/>
+      <w:u w:val="single"/>
+    </w:rPr>
+  </w:style>
+  <w:style w:type="character" w:styleId="CommentReference">
+    <w:name w:val="annotation reference"/>
+    <w:uiPriority w:val="99"/>
+    <w:unhideWhenUsed/>
+    <w:rsid w:val="00C11C0B"/>
+    <w:rPr>
+      <w:sz w:val="16"/>
+      <w:szCs w:val="16"/>
+    </w:rPr>
+  </w:style>
+  <w:style w:type="paragraph" w:styleId="CommentText">
+    <w:name w:val="annotation text"/>
+    <w:basedOn w:val="Normal"/>
+    <w:link w:val="CommentTextChar"/>
+    <w:uiPriority w:val="99"/>
+    <w:unhideWhenUsed/>
+    <w:rsid w:val="00C11C0B"/>
+    <w:rPr>
+      <w:sz w:val="20"/>
+      <w:szCs w:val="20"/>
+    </w:rPr>
+  </w:style>
+  <w:style w:type="character" w:customStyle="1" w:styleId="CommentTextChar">
+    <w:name w:val="Comment Text Char"/>
+    <w:basedOn w:val="DefaultParagraphFont"/>
+    <w:link w:val="CommentText"/>
+    <w:uiPriority w:val="99"/>
+    <w:rsid w:val="00C11C0B"/>
+  </w:style>
+  <w:style w:type="paragraph" w:styleId="CommentSubject">
+    <w:name w:val="annotation subject"/>
+    <w:basedOn w:val="CommentText"/>
+    <w:next w:val="CommentText"/>
+    <w:link w:val="CommentSubjectChar"/>
+    <w:uiPriority w:val="99"/>
+    <w:semiHidden/>
+    <w:unhideWhenUsed/>
+    <w:rsid w:val="00C11C0B"/>
+    <w:rPr>
+      <w:b/>
+      <w:bCs/>
+    </w:rPr>
+  </w:style>
+  <w:style w:type="character" w:customStyle="1" w:styleId="CommentSubjectChar">
+    <w:name w:val="Comment Subject Char"/>
+    <w:link w:val="CommentSubject"/>
+    <w:uiPriority w:val="99"/>
+    <w:semiHidden/>
+    <w:rsid w:val="00C11C0B"/>
+    <w:rPr>
+      <w:b/>
+      <w:bCs/>
+    </w:rPr>
+  </w:style>
+  <w:style w:type="paragraph" w:styleId="BalloonText">
+    <w:name w:val="Balloon Text"/>
+    <w:basedOn w:val="Normal"/>
+    <w:link w:val="BalloonTextChar"/>
+    <w:uiPriority w:val="99"/>
+    <w:semiHidden/>
+    <w:unhideWhenUsed/>
+    <w:rsid w:val="00C11C0B"/>
+    <w:pPr>
+      <w:spacing w:after="0" w:line="240" w:lineRule="auto"/>
+    </w:pPr>
+    <w:rPr>
+      <w:rFonts w:ascii="Tahoma" w:hAnsi="Tahoma" w:cs="Tahoma"/>
+      <w:sz w:val="16"/>
+      <w:szCs w:val="16"/>
+    </w:rPr>
+  </w:style>
+  <w:style w:type="character" w:customStyle="1" w:styleId="BalloonTextChar">
+    <w:name w:val="Balloon Text Char"/>
+    <w:link w:val="BalloonText"/>
+    <w:uiPriority w:val="99"/>
+    <w:semiHidden/>
+    <w:rsid w:val="00C11C0B"/>
+    <w:rPr>
+      <w:rFonts w:ascii="Tahoma" w:hAnsi="Tahoma" w:cs="Tahoma"/>
+      <w:sz w:val="16"/>
+      <w:szCs w:val="16"/>
+    </w:rPr>
+  </w:style>
+  <w:style w:type="character" w:styleId="Strong">
+    <w:name w:val="Strong"/>
+    <w:qFormat/>
+    <w:rsid w:val="00E76760"/>
+    <w:rPr>
+      <w:b/>
+      <w:bCs/>
+    </w:rPr>
+  </w:style>
   <w:style w:type="paragraph" w:styleId="NormalWeb">
     <w:name w:val="Normal (Web)"/>
     <w:basedOn w:val="Normal"/>
     <w:uiPriority w:val="99"/>
     <w:semiHidden/>
     <w:unhideWhenUsed/>
-    <w:rsid w:val="00515497"/>
+    <w:rsid w:val="005901A8"/>
     <w:pPr>
       <w:spacing w:before="100" w:beforeAutospacing="1" w:after="100" w:afterAutospacing="1" w:line="240" w:lineRule="auto"/>
     </w:pPr>
     <w:rPr>
-      <w:rFonts w:ascii="Calibri" w:hAnsi="Calibri" w:cs="Calibri"/>
+      <w:rFonts w:cs="Calibri"/>
     </w:rPr>
   </w:style>
 </w:styles>

</xml_diff>

<commit_message>
Worked on poa82combined merge function/UI.
</commit_message>
<xml_diff>
--- a/project/documents/merged/Document.docx
+++ b/project/documents/merged/Document.docx
@@ -169,7 +169,7 @@
     </w:p>
     <w:p>
       <w:r>
-        <w:t>test</w:t>
+        <w:t>Mail Stop Appeal Brief - Patents</w:t>
       </w:r>
     </w:p>
     <w:p>
@@ -222,45 +222,39 @@
           <w:noProof/>
           <w:u w:val="single"/>
         </w:rPr>
-        <w:t>&lt;&lt;</w:t>
-      </w:r>
-      <w:r>
-        <w:rPr>
-          <w:noProof/>
-          <w:u w:val="single"/>
-        </w:rPr>
-        <w:t>xmit</w:t>
-      </w:r>
-      <w:r>
-        <w:rPr>
-          <w:noProof/>
-          <w:u w:val="single"/>
-        </w:rPr>
-        <w:t>X&gt;&gt;</w:t>
-      </w:r>
-      <w:r>
-        <w:rPr>
-          <w:noProof/>
-        </w:rPr>
-        <w:tab/>
-      </w:r>
-      <w:r>
-        <w:rPr>
-          <w:noProof/>
-        </w:rPr>
-        <w:t>&lt;&lt;</w:t>
-      </w:r>
-      <w:r>
-        <w:rPr>
-          <w:noProof/>
-        </w:rPr>
-        <w:t>xmit</w:t>
-      </w:r>
-      <w:r>
-        <w:rPr>
-          <w:noProof/>
-        </w:rPr>
-        <w:t>Text&gt;&gt;</w:t>
+      </w:r>
+      <w:r>
+        <w:rPr>
+          <w:noProof/>
+          <w:u w:val="single"/>
+        </w:rPr>
+      </w:r>
+      <w:r>
+        <w:rPr>
+          <w:noProof/>
+          <w:u w:val="single"/>
+        </w:rPr>
+      </w:r>
+      <w:r>
+        <w:rPr>
+          <w:noProof/>
+        </w:rPr>
+        <w:tab/>
+      </w:r>
+      <w:r>
+        <w:rPr>
+          <w:noProof/>
+        </w:rPr>
+      </w:r>
+      <w:r>
+        <w:rPr>
+          <w:noProof/>
+        </w:rPr>
+      </w:r>
+      <w:r>
+        <w:rPr>
+          <w:noProof/>
+        </w:rPr>
       </w:r>
     </w:p>
     <w:p>
@@ -282,7 +276,7 @@
           <w:szCs w:val="22"/>
           <w:u w:val="single"/>
         </w:rPr>
-        <w:t>&lt;&lt;</w:t>
+        <w:t>X</w:t>
       </w:r>
       <w:r>
         <w:rPr>
@@ -291,7 +285,6 @@
           <w:szCs w:val="22"/>
           <w:u w:val="single"/>
         </w:rPr>
-        <w:t>POA</w:t>
       </w:r>
       <w:r>
         <w:rPr>
@@ -300,7 +293,6 @@
           <w:szCs w:val="22"/>
           <w:u w:val="single"/>
         </w:rPr>
-        <w:t>X&gt;&gt;</w:t>
       </w:r>
       <w:r>
         <w:rPr>
@@ -316,19 +308,17 @@
           <w:sz w:val="22"/>
           <w:szCs w:val="22"/>
         </w:rPr>
-        <w:t>&lt;&lt;</w:t>
-      </w:r>
-      <w:r>
-        <w:rPr>
-          <w:noProof/>
-        </w:rPr>
-        <w:t>POA</w:t>
-      </w:r>
-      <w:r>
-        <w:rPr>
-          <w:noProof/>
-        </w:rPr>
-        <w:t>Text</w:t>
+        <w:t>Transmittal for Power of Attorney to one or More Registered Practioners (PTO/AIA/82) (1 pg.)</w:t>
+      </w:r>
+      <w:r>
+        <w:rPr>
+          <w:noProof/>
+        </w:rPr>
+      </w:r>
+      <w:r>
+        <w:rPr>
+          <w:noProof/>
+        </w:rPr>
       </w:r>
       <w:r>
         <w:rPr>
@@ -336,7 +326,6 @@
           <w:sz w:val="22"/>
           <w:szCs w:val="22"/>
         </w:rPr>
-        <w:t>&gt;&gt;</w:t>
       </w:r>
     </w:p>
     <w:p>
@@ -356,7 +345,7 @@
           <w:noProof/>
           <w:u w:val="single"/>
         </w:rPr>
-        <w:t>&lt;&lt;doc1X&gt;&gt;</w:t>
+        <w:t>X</w:t>
       </w:r>
       <w:r>
         <w:rPr>
@@ -370,7 +359,7 @@
           <w:bCs/>
           <w:noProof/>
         </w:rPr>
-        <w:t>&lt;&lt;doc1Text&gt;&gt;</w:t>
+        <w:t>1</w:t>
       </w:r>
     </w:p>
     <w:p>
@@ -388,19 +377,19 @@
           <w:noProof/>
           <w:u w:val="single"/>
         </w:rPr>
-        <w:t>&lt;&lt;doc2X&gt;&gt;</w:t>
-      </w:r>
-      <w:r>
-        <w:rPr>
-          <w:noProof/>
-        </w:rPr>
-        <w:tab/>
-      </w:r>
-      <w:r>
-        <w:rPr>
-          <w:noProof/>
-        </w:rPr>
-        <w:t>&lt;&lt;doc2Text&gt;&gt;</w:t>
+        <w:t>X</w:t>
+      </w:r>
+      <w:r>
+        <w:rPr>
+          <w:noProof/>
+        </w:rPr>
+        <w:tab/>
+      </w:r>
+      <w:r>
+        <w:rPr>
+          <w:noProof/>
+        </w:rPr>
+        <w:t>2</w:t>
       </w:r>
     </w:p>
     <w:p>
@@ -418,14 +407,14 @@
           <w:noProof/>
           <w:u w:val="single"/>
         </w:rPr>
-        <w:t>&lt;&lt;doc3X&gt;&gt;</w:t>
-      </w:r>
-      <w:r>
-        <w:rPr>
-          <w:noProof/>
-        </w:rPr>
-        <w:tab/>
-        <w:t>&lt;&lt;doc3Text&gt;&gt;</w:t>
+        <w:t>X</w:t>
+      </w:r>
+      <w:r>
+        <w:rPr>
+          <w:noProof/>
+        </w:rPr>
+        <w:tab/>
+        <w:t>3</w:t>
       </w:r>
     </w:p>
     <w:p>
@@ -615,28 +604,24 @@
           <w:noProof/>
           <w:u w:val="single"/>
         </w:rPr>
-        <w:t>&lt;&lt;postcard</w:t>
-      </w:r>
-      <w:r>
-        <w:rPr>
-          <w:noProof/>
-          <w:u w:val="single"/>
-        </w:rPr>
-        <w:t>X</w:t>
-      </w:r>
-      <w:r>
-        <w:rPr>
-          <w:noProof/>
-          <w:u w:val="single"/>
-        </w:rPr>
-        <w:t>&gt;&gt;</w:t>
-      </w:r>
-      <w:r>
-        <w:rPr>
-          <w:noProof/>
-        </w:rPr>
-        <w:tab/>
-        <w:t>&lt;&lt;postcardText&gt;&gt;</w:t>
+      </w:r>
+      <w:r>
+        <w:rPr>
+          <w:noProof/>
+          <w:u w:val="single"/>
+        </w:rPr>
+      </w:r>
+      <w:r>
+        <w:rPr>
+          <w:noProof/>
+          <w:u w:val="single"/>
+        </w:rPr>
+      </w:r>
+      <w:r>
+        <w:rPr>
+          <w:noProof/>
+        </w:rPr>
+        <w:tab/>
       </w:r>
     </w:p>
     <w:p>
@@ -671,7 +656,7 @@
           <w:bCs/>
           <w:sz w:val="20"/>
         </w:rPr>
-        <w:t xml:space="preserve">If not provided for in a separate paper filed herewith, please consider this a PETITION FOR EXTENSION OF TIME for sufficient number of months to enter these papers and please charge any additional fees or credit overpayment to Deposit Account No. &lt;&lt;depAccount&gt;&gt;. If </w:t>
+        <w:t xml:space="preserve">If not provided for in a separate paper filed herewith, please consider this a PETITION FOR EXTENSION OF TIME for sufficient number of months to enter these papers and please charge any additional fees or credit overpayment to Deposit Account No. 19-0743. If </w:t>
       </w:r>
       <w:r>
         <w:rPr>
@@ -758,6 +743,7 @@
           <w:sz w:val="28"/>
           <w:szCs w:val="28"/>
         </w:rPr>
+        <w:t>/ {{Sig_es_:signer1:signature}} /</w:t>
       </w:r>
     </w:p>
     <w:bookmarkEnd w:id="0"/>
@@ -853,141 +839,6 @@
         <w:t xml:space="preserve">Reg. No. </w:t>
       </w:r>
       <w:r/>
-    </w:p>
-    <w:p>
-      <w:pPr>
-        <w:pStyle w:val="BlockText"/>
-        <w:ind w:left="0" w:right="0"/>
-        <w:jc w:val="left"/>
-        <w:rPr>
-          <w:b w:val="0"/>
-          <w:bCs w:val="0"/>
-          <w:szCs w:val="20"/>
-        </w:rPr>
-      </w:pPr>
-    </w:p>
-    <w:p>
-      <w:pPr>
-        <w:rPr>
-          <w:sz w:val="18"/>
-          <w:szCs w:val="18"/>
-        </w:rPr>
-      </w:pPr>
-      <w:r>
-        <w:rPr>
-          <w:noProof/>
-          <w:sz w:val="18"/>
-          <w:szCs w:val="18"/>
-        </w:rPr>
-        <w:t>&lt;&lt;certificateCF&gt;&gt;</w:t>
-      </w:r>
-    </w:p>
-    <w:p>
-      <w:pPr>
-        <w:rPr>
-          <w:sz w:val="18"/>
-          <w:szCs w:val="18"/>
-        </w:rPr>
-      </w:pPr>
-    </w:p>
-    <w:p>
-      <w:pPr>
-        <w:rPr>
-          <w:sz w:val="18"/>
-          <w:szCs w:val="18"/>
-        </w:rPr>
-      </w:pPr>
-    </w:p>
-    <w:p>
-      <w:pPr>
-        <w:tabs>
-          <w:tab w:val="left" w:pos="5040"/>
-        </w:tabs>
-        <w:rPr>
-          <w:sz w:val="18"/>
-          <w:szCs w:val="18"/>
-        </w:rPr>
-      </w:pPr>
-      <w:r>
-        <w:rPr>
-          <w:sz w:val="18"/>
-          <w:szCs w:val="18"/>
-        </w:rPr>
-        <w:t>&lt;&lt;nameLine&gt;&gt;</w:t>
-      </w:r>
-      <w:r>
-        <w:rPr>
-          <w:sz w:val="18"/>
-          <w:szCs w:val="18"/>
-        </w:rPr>
-        <w:tab/>
-      </w:r>
-      <w:r>
-        <w:rPr>
-          <w:sz w:val="18"/>
-          <w:szCs w:val="18"/>
-        </w:rPr>
-        <w:t>&lt;&lt;sigLine&gt;&gt;</w:t>
-      </w:r>
-    </w:p>
-    <w:p>
-      <w:pPr>
-        <w:tabs>
-          <w:tab w:val="left" w:pos="5040"/>
-        </w:tabs>
-        <w:jc w:val="both"/>
-      </w:pPr>
-      <w:r>
-        <w:rPr>
-          <w:sz w:val="18"/>
-          <w:szCs w:val="18"/>
-        </w:rPr>
-        <w:t>&lt;&lt;nam</w:t>
-      </w:r>
-      <w:r>
-        <w:rPr>
-          <w:sz w:val="18"/>
-          <w:szCs w:val="18"/>
-        </w:rPr>
-        <w:t>Name</w:t>
-      </w:r>
-      <w:r>
-        <w:rPr>
-          <w:sz w:val="18"/>
-          <w:szCs w:val="18"/>
-        </w:rPr>
-        <w:t>&gt;&gt;</w:t>
-      </w:r>
-      <w:r>
-        <w:rPr>
-          <w:sz w:val="18"/>
-          <w:szCs w:val="18"/>
-        </w:rPr>
-        <w:tab/>
-      </w:r>
-      <w:r>
-        <w:rPr>
-          <w:sz w:val="18"/>
-          <w:szCs w:val="18"/>
-        </w:rPr>
-        <w:t>&lt;&lt;sig</w:t>
-      </w:r>
-      <w:r>
-        <w:rPr>
-          <w:sz w:val="18"/>
-          <w:szCs w:val="18"/>
-        </w:rPr>
-        <w:t>Signature</w:t>
-      </w:r>
-      <w:r>
-        <w:rPr>
-          <w:sz w:val="18"/>
-          <w:szCs w:val="18"/>
-        </w:rPr>
-        <w:t>&gt;&gt;</w:t>
-      </w:r>
-    </w:p>
-    <w:p>
       <w:r>
         <w:br w:type="page"/>
       </w:r>
@@ -1523,6 +1374,7 @@
                 <w:sz w:val="22"/>
                 <w:szCs w:val="22"/>
               </w:rPr>
+              <w:t>/ {{Sig_es_:signer1:signature}} /</w:t>
             </w:r>
           </w:p>
         </w:tc>
@@ -1551,7 +1403,9 @@
             <w:tcW w:w="2340" w:type="dxa"/>
           </w:tcPr>
           <w:p>
-            <w:r/>
+            <w:r>
+              <w:t>{{Dte_es_:signer1:date}}</w:t>
+            </w:r>
           </w:p>
         </w:tc>
       </w:tr>
@@ -1724,7 +1578,6 @@
                   <w14:uncheckedState w14:val="2610" w14:font="MS Gothic"/>
                 </w14:checkbox>
               </w:sdtPr>
-              <w:sdtEndPr/>
               <w:sdtContent>
                 <w:r>
                   <w:rPr>

</xml_diff>